<commit_message>
Recover WIP: package layout rename + import/export routers
Restores the uncommitted work lost during the failed merge, recovered from
the stash tree 989b225 (WIP on DocsWork 6b6c067).

- Rename flat modules into packages with __init__.py (db, models,
  repositories, routers, schemas, services)
- db/init.py -> db/bootstrap.py, models/static.py -> models/domain.py,
  schemas/get_docs.py -> schemas/imports.py, services/export_docs.py ->
  services/documents.py, services/get_docs.py -> services/imports.py
- Add routers/documents.py (/export/directions/test) and
  routers/imports.py (/import/students), schemas/documents.py
- Drop the bogus "src/ routers/..." paths created by the broken merge
- Update Napravlenie.docx template and .gitignore; add TheTask.md
</commit_message>
<xml_diff>
--- a/templates/Napravlenie.docx
+++ b/templates/Napravlenie.docx
@@ -406,6 +406,7 @@
                 <w:b/>
                 <w:sz w:val="22"/>
                 <w:szCs w:val="22"/>
+                <w:lang w:val="en-US"/>
               </w:rPr>
             </w:pPr>
             <w:r>
@@ -419,6 +420,7 @@
               <w:rPr>
                 <w:sz w:val="24"/>
                 <w:szCs w:val="24"/>
+                <w:lang w:val="en-US"/>
               </w:rPr>
               <w:t xml:space="preserve"> </w:t>
             </w:r>
@@ -433,6 +435,7 @@
               <w:rPr>
                 <w:sz w:val="24"/>
                 <w:szCs w:val="24"/>
+                <w:lang w:val="en-US"/>
               </w:rPr>
               <w:t xml:space="preserve"> – </w:t>
             </w:r>
@@ -447,6 +450,7 @@
               <w:rPr>
                 <w:sz w:val="24"/>
                 <w:szCs w:val="24"/>
+                <w:lang w:val="en-US"/>
               </w:rPr>
               <w:t xml:space="preserve"> </w:t>
             </w:r>
@@ -461,6 +465,7 @@
               <w:rPr>
                 <w:sz w:val="24"/>
                 <w:szCs w:val="24"/>
+                <w:lang w:val="en-US"/>
               </w:rPr>
               <w:t xml:space="preserve">: </w:t>
             </w:r>
@@ -469,245 +474,404 @@
                 <w:b/>
                 <w:sz w:val="22"/>
                 <w:szCs w:val="22"/>
+                <w:lang w:val="en-US"/>
+              </w:rPr>
+              <w:t>__</w:t>
+            </w:r>
+            <w:r>
+              <w:rPr>
+                <w:b/>
+                <w:sz w:val="22"/>
+                <w:szCs w:val="22"/>
+                <w:u w:val="single"/>
+                <w:lang w:val="en-US"/>
+              </w:rPr>
+              <w:t xml:space="preserve">{{ </w:t>
+            </w:r>
+            <w:proofErr w:type="spellStart"/>
+            <w:r>
+              <w:rPr>
+                <w:b/>
+                <w:sz w:val="22"/>
+                <w:szCs w:val="22"/>
+                <w:u w:val="single"/>
+                <w:lang w:val="en-US"/>
+              </w:rPr>
+              <w:t>organ</w:t>
+            </w:r>
+            <w:r>
+              <w:rPr>
+                <w:b/>
+                <w:sz w:val="22"/>
+                <w:szCs w:val="22"/>
+                <w:u w:val="single"/>
+                <w:lang w:val="en-US"/>
+              </w:rPr>
+              <w:t>i</w:t>
+            </w:r>
+            <w:r>
+              <w:rPr>
+                <w:b/>
+                <w:sz w:val="22"/>
+                <w:szCs w:val="22"/>
+                <w:u w:val="single"/>
+                <w:lang w:val="en-US"/>
+              </w:rPr>
+              <w:t>z</w:t>
+            </w:r>
+            <w:r>
+              <w:rPr>
+                <w:b/>
+                <w:sz w:val="22"/>
+                <w:szCs w:val="22"/>
+                <w:u w:val="single"/>
+                <w:lang w:val="en-US"/>
+              </w:rPr>
+              <w:t>ation</w:t>
+            </w:r>
+            <w:r>
+              <w:rPr>
+                <w:b/>
+                <w:sz w:val="22"/>
+                <w:szCs w:val="22"/>
+                <w:u w:val="single"/>
+                <w:lang w:val="en-US"/>
               </w:rPr>
               <w:t>_</w:t>
             </w:r>
-            <w:proofErr w:type="gramStart"/>
-            <w:r>
-              <w:rPr>
-                <w:b/>
-                <w:sz w:val="22"/>
-                <w:szCs w:val="22"/>
+            <w:r>
+              <w:rPr>
+                <w:b/>
+                <w:sz w:val="22"/>
+                <w:szCs w:val="22"/>
+                <w:u w:val="single"/>
+                <w:lang w:val="en-US"/>
+              </w:rPr>
+              <w:t>name</w:t>
+            </w:r>
+            <w:proofErr w:type="spellEnd"/>
+            <w:r>
+              <w:rPr>
+                <w:b/>
+                <w:sz w:val="22"/>
+                <w:szCs w:val="22"/>
+                <w:u w:val="single"/>
+                <w:lang w:val="en-US"/>
+              </w:rPr>
+              <w:t>}}</w:t>
+            </w:r>
+            <w:r>
+              <w:rPr>
+                <w:b/>
+                <w:sz w:val="22"/>
+                <w:szCs w:val="22"/>
+                <w:lang w:val="en-US"/>
+              </w:rPr>
+              <w:t>_______</w:t>
+            </w:r>
+          </w:p>
+          <w:p>
+            <w:pPr>
+              <w:spacing w:line="216" w:lineRule="auto"/>
+              <w:rPr>
+                <w:sz w:val="24"/>
+                <w:szCs w:val="24"/>
+                <w:lang w:val="en-US"/>
+              </w:rPr>
+            </w:pPr>
+            <w:r>
+              <w:rPr>
+                <w:sz w:val="24"/>
+                <w:szCs w:val="24"/>
+                <w:lang w:val="en-US"/>
+              </w:rPr>
+              <w:t>_________________________________________________________________________________________________________________________________</w:t>
+            </w:r>
+          </w:p>
+          <w:p>
+            <w:pPr>
+              <w:spacing w:line="216" w:lineRule="auto"/>
+              <w:rPr>
+                <w:sz w:val="22"/>
+                <w:szCs w:val="22"/>
+                <w:lang w:val="en-US"/>
+              </w:rPr>
+            </w:pPr>
+            <w:r>
+              <w:rPr>
+                <w:sz w:val="24"/>
+                <w:szCs w:val="24"/>
+              </w:rPr>
+              <w:t>Сроки</w:t>
+            </w:r>
+            <w:r>
+              <w:rPr>
+                <w:sz w:val="24"/>
+                <w:szCs w:val="24"/>
+                <w:lang w:val="en-US"/>
+              </w:rPr>
+              <w:t xml:space="preserve">: </w:t>
+            </w:r>
+            <w:r>
+              <w:rPr>
+                <w:sz w:val="22"/>
+                <w:szCs w:val="22"/>
+              </w:rPr>
+              <w:t>с</w:t>
+            </w:r>
+            <w:r>
+              <w:rPr>
+                <w:sz w:val="22"/>
+                <w:szCs w:val="22"/>
+                <w:lang w:val="en-US"/>
+              </w:rPr>
+              <w:t xml:space="preserve"> </w:t>
+            </w:r>
+            <w:r>
+              <w:rPr>
+                <w:sz w:val="22"/>
+                <w:szCs w:val="22"/>
+                <w:u w:val="single"/>
+                <w:lang w:val="en-US"/>
+              </w:rPr>
+              <w:t xml:space="preserve">{{ </w:t>
+            </w:r>
+            <w:proofErr w:type="spellStart"/>
+            <w:r>
+              <w:rPr>
+                <w:sz w:val="22"/>
+                <w:szCs w:val="22"/>
+                <w:u w:val="single"/>
+                <w:lang w:val="en-US"/>
+              </w:rPr>
+              <w:t>practice_start_date</w:t>
+            </w:r>
+            <w:proofErr w:type="spellEnd"/>
+            <w:r>
+              <w:rPr>
+                <w:sz w:val="22"/>
+                <w:szCs w:val="22"/>
+                <w:u w:val="single"/>
+                <w:lang w:val="en-US"/>
+              </w:rPr>
+              <w:t xml:space="preserve"> }}</w:t>
+            </w:r>
+            <w:r>
+              <w:rPr>
+                <w:sz w:val="22"/>
+                <w:szCs w:val="22"/>
+              </w:rPr>
+              <w:t>по</w:t>
+            </w:r>
+            <w:r>
+              <w:rPr>
+                <w:sz w:val="22"/>
+                <w:szCs w:val="22"/>
+                <w:u w:val="single"/>
+                <w:lang w:val="en-US"/>
+              </w:rPr>
+              <w:t xml:space="preserve">{{ </w:t>
+            </w:r>
+            <w:proofErr w:type="spellStart"/>
+            <w:r>
+              <w:rPr>
+                <w:sz w:val="22"/>
+                <w:szCs w:val="22"/>
+                <w:u w:val="single"/>
+                <w:lang w:val="en-US"/>
+              </w:rPr>
+              <w:t>practice_end_date</w:t>
+            </w:r>
+            <w:proofErr w:type="spellEnd"/>
+            <w:r>
+              <w:rPr>
+                <w:sz w:val="22"/>
+                <w:szCs w:val="22"/>
+                <w:u w:val="single"/>
+                <w:lang w:val="en-US"/>
+              </w:rPr>
+              <w:t xml:space="preserve"> }}</w:t>
+            </w:r>
+          </w:p>
+          <w:p>
+            <w:pPr>
+              <w:jc w:val="both"/>
+              <w:rPr>
+                <w:sz w:val="24"/>
+                <w:szCs w:val="24"/>
+                <w:lang w:val="en-US"/>
+              </w:rPr>
+            </w:pPr>
+          </w:p>
+          <w:p>
+            <w:pPr>
+              <w:jc w:val="both"/>
+              <w:rPr>
+                <w:sz w:val="24"/>
+                <w:szCs w:val="24"/>
+              </w:rPr>
+            </w:pPr>
+            <w:r>
+              <w:rPr>
+                <w:sz w:val="24"/>
+                <w:szCs w:val="24"/>
+              </w:rPr>
+              <w:t>1 Выполнение программы практики _____________________________</w:t>
+            </w:r>
+            <w:r>
+              <w:rPr>
+                <w:sz w:val="24"/>
+                <w:szCs w:val="24"/>
+              </w:rPr>
+              <w:t>_____</w:t>
+            </w:r>
+          </w:p>
+          <w:p>
+            <w:pPr>
+              <w:jc w:val="both"/>
+              <w:rPr>
+                <w:sz w:val="16"/>
+                <w:szCs w:val="16"/>
+              </w:rPr>
+            </w:pPr>
+            <w:r>
+              <w:rPr>
+                <w:sz w:val="16"/>
+                <w:szCs w:val="16"/>
+              </w:rPr>
+              <w:t xml:space="preserve">                                                                            (выполнена, выполнена не в полном объеме, не выполнена)</w:t>
+            </w:r>
+          </w:p>
+          <w:p>
+            <w:pPr>
+              <w:jc w:val="both"/>
+              <w:rPr>
+                <w:sz w:val="24"/>
+                <w:szCs w:val="24"/>
+              </w:rPr>
+            </w:pPr>
+            <w:r>
+              <w:rPr>
+                <w:sz w:val="24"/>
+                <w:szCs w:val="24"/>
+              </w:rPr>
+              <w:t>2 Выполнение индивидуального задания _________________________</w:t>
+            </w:r>
+            <w:r>
+              <w:rPr>
+                <w:sz w:val="24"/>
+                <w:szCs w:val="24"/>
+              </w:rPr>
+              <w:t>_____</w:t>
+            </w:r>
+          </w:p>
+          <w:p>
+            <w:pPr>
+              <w:jc w:val="both"/>
+              <w:rPr>
+                <w:sz w:val="16"/>
+                <w:szCs w:val="16"/>
+              </w:rPr>
+            </w:pPr>
+            <w:r>
+              <w:rPr>
+                <w:sz w:val="16"/>
+                <w:szCs w:val="16"/>
+              </w:rPr>
+              <w:t xml:space="preserve">                                                                            (выполнена, выполнена не в полном объеме, не выполнена)</w:t>
+            </w:r>
+          </w:p>
+          <w:p>
+            <w:pPr>
+              <w:jc w:val="both"/>
+              <w:rPr>
+                <w:sz w:val="24"/>
+                <w:szCs w:val="24"/>
+              </w:rPr>
+            </w:pPr>
+            <w:r>
+              <w:rPr>
+                <w:sz w:val="24"/>
+                <w:szCs w:val="24"/>
+              </w:rPr>
+              <w:t>3 Общая характеристика студента _______________________________</w:t>
+            </w:r>
+            <w:r>
+              <w:rPr>
+                <w:sz w:val="24"/>
+                <w:szCs w:val="24"/>
+              </w:rPr>
+              <w:t>____</w:t>
+            </w:r>
+          </w:p>
+          <w:p>
+            <w:pPr>
+              <w:jc w:val="both"/>
+              <w:rPr>
+                <w:sz w:val="24"/>
+                <w:szCs w:val="24"/>
+              </w:rPr>
+            </w:pPr>
+            <w:r>
+              <w:rPr>
+                <w:sz w:val="24"/>
+                <w:szCs w:val="24"/>
+              </w:rPr>
+              <w:t>___________________________________________________________________________________________________________________________________________________________________________________________________</w:t>
+            </w:r>
+            <w:r>
+              <w:rPr>
+                <w:sz w:val="24"/>
+                <w:szCs w:val="24"/>
+              </w:rPr>
+              <w:t>_________________________________________________________________</w:t>
+            </w:r>
+          </w:p>
+          <w:p>
+            <w:pPr>
+              <w:jc w:val="both"/>
+              <w:rPr>
+                <w:sz w:val="24"/>
+                <w:szCs w:val="24"/>
+              </w:rPr>
+            </w:pPr>
+            <w:r>
+              <w:rPr>
+                <w:sz w:val="24"/>
+                <w:szCs w:val="24"/>
+              </w:rPr>
+              <w:t>_________________________________________________________________</w:t>
+            </w:r>
+          </w:p>
+          <w:p>
+            <w:pPr>
+              <w:jc w:val="both"/>
+              <w:rPr>
+                <w:sz w:val="24"/>
+                <w:szCs w:val="24"/>
+              </w:rPr>
+            </w:pPr>
+            <w:r>
+              <w:rPr>
+                <w:sz w:val="24"/>
+                <w:szCs w:val="24"/>
+              </w:rPr>
+              <w:t>4 Замечания _________________________________________________</w:t>
+            </w:r>
+            <w:r>
+              <w:rPr>
+                <w:sz w:val="24"/>
+                <w:szCs w:val="24"/>
+              </w:rPr>
+              <w:t>____</w:t>
+            </w:r>
+            <w:r>
+              <w:rPr>
+                <w:sz w:val="24"/>
+                <w:szCs w:val="24"/>
               </w:rPr>
               <w:t>_</w:t>
             </w:r>
-            <w:r>
-              <w:rPr>
-                <w:b/>
-                <w:sz w:val="22"/>
-                <w:szCs w:val="22"/>
-                <w:u w:val="single"/>
-              </w:rPr>
-              <w:t>{</w:t>
-            </w:r>
-            <w:proofErr w:type="gramEnd"/>
-            <w:r>
-              <w:rPr>
-                <w:b/>
-                <w:sz w:val="22"/>
-                <w:szCs w:val="22"/>
-                <w:u w:val="single"/>
-              </w:rPr>
-              <w:t xml:space="preserve">{ </w:t>
-            </w:r>
-            <w:r>
-              <w:rPr>
-                <w:b/>
-                <w:sz w:val="22"/>
-                <w:szCs w:val="22"/>
-                <w:u w:val="single"/>
-                <w:lang w:val="en-US"/>
-              </w:rPr>
-              <w:t>organ</w:t>
-            </w:r>
-            <w:r>
-              <w:rPr>
-                <w:b/>
-                <w:sz w:val="22"/>
-                <w:szCs w:val="22"/>
-                <w:u w:val="single"/>
-                <w:lang w:val="en-US"/>
-              </w:rPr>
-              <w:t>i</w:t>
-            </w:r>
-            <w:r>
-              <w:rPr>
-                <w:b/>
-                <w:sz w:val="22"/>
-                <w:szCs w:val="22"/>
-                <w:u w:val="single"/>
-                <w:lang w:val="en-US"/>
-              </w:rPr>
-              <w:t>z</w:t>
-            </w:r>
-            <w:r>
-              <w:rPr>
-                <w:b/>
-                <w:sz w:val="22"/>
-                <w:szCs w:val="22"/>
-                <w:u w:val="single"/>
-                <w:lang w:val="en-US"/>
-              </w:rPr>
-              <w:t>ation</w:t>
-            </w:r>
-            <w:r>
-              <w:rPr>
-                <w:b/>
-                <w:sz w:val="22"/>
-                <w:szCs w:val="22"/>
-                <w:u w:val="single"/>
-              </w:rPr>
-              <w:t>_</w:t>
-            </w:r>
-            <w:r>
-              <w:rPr>
-                <w:b/>
-                <w:sz w:val="22"/>
-                <w:szCs w:val="22"/>
-                <w:u w:val="single"/>
-                <w:lang w:val="en-US"/>
-              </w:rPr>
-              <w:t>name</w:t>
-            </w:r>
-            <w:r>
-              <w:rPr>
-                <w:b/>
-                <w:sz w:val="22"/>
-                <w:szCs w:val="22"/>
-                <w:u w:val="single"/>
-              </w:rPr>
-              <w:t>}}</w:t>
-            </w:r>
-            <w:r>
-              <w:rPr>
-                <w:b/>
-                <w:sz w:val="22"/>
-                <w:szCs w:val="22"/>
-              </w:rPr>
-              <w:t>_______</w:t>
-            </w:r>
-          </w:p>
-          <w:p>
-            <w:pPr>
-              <w:spacing w:line="216" w:lineRule="auto"/>
-              <w:rPr>
-                <w:sz w:val="24"/>
-                <w:szCs w:val="24"/>
-              </w:rPr>
-            </w:pPr>
-            <w:r>
-              <w:rPr>
-                <w:sz w:val="24"/>
-                <w:szCs w:val="24"/>
-              </w:rPr>
-              <w:t>_________________________________________________________________________________________________________________________________</w:t>
-            </w:r>
-          </w:p>
-          <w:p>
-            <w:pPr>
-              <w:spacing w:line="216" w:lineRule="auto"/>
-              <w:rPr>
-                <w:sz w:val="22"/>
-                <w:szCs w:val="22"/>
-                <w:lang w:val="en-US"/>
-              </w:rPr>
-            </w:pPr>
-            <w:r>
-              <w:rPr>
-                <w:sz w:val="24"/>
-                <w:szCs w:val="24"/>
-              </w:rPr>
-              <w:t>Сроки</w:t>
-            </w:r>
-            <w:r>
-              <w:rPr>
-                <w:sz w:val="24"/>
-                <w:szCs w:val="24"/>
-                <w:lang w:val="en-US"/>
-              </w:rPr>
-              <w:t xml:space="preserve">: </w:t>
-            </w:r>
-            <w:r>
-              <w:rPr>
-                <w:sz w:val="22"/>
-                <w:szCs w:val="22"/>
-              </w:rPr>
-              <w:t>с</w:t>
-            </w:r>
-            <w:r>
-              <w:rPr>
-                <w:sz w:val="22"/>
-                <w:szCs w:val="22"/>
-                <w:lang w:val="en-US"/>
-              </w:rPr>
-              <w:t xml:space="preserve"> </w:t>
-            </w:r>
-            <w:proofErr w:type="gramStart"/>
-            <w:r>
-              <w:rPr>
-                <w:sz w:val="22"/>
-                <w:szCs w:val="22"/>
-                <w:u w:val="single"/>
-                <w:lang w:val="en-US"/>
-              </w:rPr>
-              <w:t xml:space="preserve">{{ </w:t>
-            </w:r>
-            <w:proofErr w:type="spellStart"/>
-            <w:r>
-              <w:rPr>
-                <w:sz w:val="22"/>
-                <w:szCs w:val="22"/>
-                <w:u w:val="single"/>
-                <w:lang w:val="en-US"/>
-              </w:rPr>
-              <w:t>practice</w:t>
-            </w:r>
-            <w:proofErr w:type="gramEnd"/>
-            <w:r>
-              <w:rPr>
-                <w:sz w:val="22"/>
-                <w:szCs w:val="22"/>
-                <w:u w:val="single"/>
-                <w:lang w:val="en-US"/>
-              </w:rPr>
-              <w:t>_start_date</w:t>
-            </w:r>
-            <w:proofErr w:type="spellEnd"/>
-            <w:r>
-              <w:rPr>
-                <w:sz w:val="22"/>
-                <w:szCs w:val="22"/>
-                <w:u w:val="single"/>
-                <w:lang w:val="en-US"/>
-              </w:rPr>
-              <w:t xml:space="preserve"> }}</w:t>
-            </w:r>
-            <w:r>
-              <w:rPr>
-                <w:sz w:val="22"/>
-                <w:szCs w:val="22"/>
-              </w:rPr>
-              <w:t>по</w:t>
-            </w:r>
-            <w:r>
-              <w:rPr>
-                <w:sz w:val="22"/>
-                <w:szCs w:val="22"/>
-                <w:u w:val="single"/>
-                <w:lang w:val="en-US"/>
-              </w:rPr>
-              <w:t xml:space="preserve">{{ </w:t>
-            </w:r>
-            <w:proofErr w:type="spellStart"/>
-            <w:r>
-              <w:rPr>
-                <w:sz w:val="22"/>
-                <w:szCs w:val="22"/>
-                <w:u w:val="single"/>
-                <w:lang w:val="en-US"/>
-              </w:rPr>
-              <w:t>practice_end_date</w:t>
-            </w:r>
-            <w:proofErr w:type="spellEnd"/>
-            <w:r>
-              <w:rPr>
-                <w:sz w:val="22"/>
-                <w:szCs w:val="22"/>
-                <w:u w:val="single"/>
-                <w:lang w:val="en-US"/>
-              </w:rPr>
-              <w:t xml:space="preserve"> }}</w:t>
-            </w:r>
           </w:p>
           <w:p>
             <w:pPr>
@@ -715,12 +879,26 @@
               <w:rPr>
                 <w:sz w:val="24"/>
                 <w:szCs w:val="24"/>
-                <w:lang w:val="en-US"/>
-              </w:rPr>
-            </w:pPr>
-          </w:p>
-          <w:p>
-            <w:pPr>
+              </w:rPr>
+            </w:pPr>
+            <w:r>
+              <w:rPr>
+                <w:sz w:val="24"/>
+                <w:szCs w:val="24"/>
+              </w:rPr>
+              <w:t>______________________________________________________________________________________________________________________________________________________________________________________________</w:t>
+            </w:r>
+            <w:r>
+              <w:rPr>
+                <w:sz w:val="24"/>
+                <w:szCs w:val="24"/>
+              </w:rPr>
+              <w:t>_____</w:t>
+            </w:r>
+          </w:p>
+          <w:p>
+            <w:pPr>
+              <w:spacing w:line="216" w:lineRule="auto"/>
               <w:jc w:val="both"/>
               <w:rPr>
                 <w:sz w:val="24"/>
@@ -732,30 +910,30 @@
                 <w:sz w:val="24"/>
                 <w:szCs w:val="24"/>
               </w:rPr>
-              <w:t>1 Выполнение программы практики _____________________________</w:t>
-            </w:r>
-            <w:r>
-              <w:rPr>
-                <w:sz w:val="24"/>
-                <w:szCs w:val="24"/>
-              </w:rPr>
-              <w:t>_____</w:t>
+              <w:t>5 Рекомендации _____________________________________________</w:t>
+            </w:r>
+            <w:r>
+              <w:rPr>
+                <w:sz w:val="24"/>
+                <w:szCs w:val="24"/>
+              </w:rPr>
+              <w:t>______</w:t>
             </w:r>
           </w:p>
           <w:p>
             <w:pPr>
               <w:jc w:val="both"/>
               <w:rPr>
-                <w:sz w:val="16"/>
-                <w:szCs w:val="16"/>
-              </w:rPr>
-            </w:pPr>
-            <w:r>
-              <w:rPr>
-                <w:sz w:val="16"/>
-                <w:szCs w:val="16"/>
-              </w:rPr>
-              <w:t xml:space="preserve">                                                                            (выполнена, выполнена не в полном объеме, не выполнена)</w:t>
+                <w:sz w:val="24"/>
+                <w:szCs w:val="24"/>
+              </w:rPr>
+            </w:pPr>
+            <w:r>
+              <w:rPr>
+                <w:sz w:val="24"/>
+                <w:szCs w:val="24"/>
+              </w:rPr>
+              <w:t>__________________________________________________________________________________________________________________________________</w:t>
             </w:r>
           </w:p>
           <w:p>
@@ -771,57 +949,38 @@
                 <w:sz w:val="24"/>
                 <w:szCs w:val="24"/>
               </w:rPr>
-              <w:t>2 Выполнение индивидуального задания _________________________</w:t>
-            </w:r>
-            <w:r>
-              <w:rPr>
-                <w:sz w:val="24"/>
-                <w:szCs w:val="24"/>
-              </w:rPr>
-              <w:t>_____</w:t>
+              <w:t>_________________________________________________________________</w:t>
             </w:r>
           </w:p>
           <w:p>
             <w:pPr>
               <w:jc w:val="both"/>
               <w:rPr>
-                <w:sz w:val="16"/>
-                <w:szCs w:val="16"/>
-              </w:rPr>
-            </w:pPr>
-            <w:r>
-              <w:rPr>
-                <w:sz w:val="16"/>
-                <w:szCs w:val="16"/>
-              </w:rPr>
-              <w:t xml:space="preserve">                                                                            (выполнена, выполнена не в полном объеме, не выполнена)</w:t>
-            </w:r>
-          </w:p>
-          <w:p>
-            <w:pPr>
+                <w:sz w:val="24"/>
+                <w:szCs w:val="24"/>
+              </w:rPr>
+            </w:pPr>
+            <w:r>
+              <w:rPr>
+                <w:sz w:val="24"/>
+                <w:szCs w:val="24"/>
+              </w:rPr>
+              <w:t>_________________________________________________________________</w:t>
+            </w:r>
+          </w:p>
+          <w:p>
+            <w:pPr>
+              <w:spacing w:line="216" w:lineRule="auto"/>
               <w:jc w:val="both"/>
               <w:rPr>
                 <w:sz w:val="24"/>
                 <w:szCs w:val="24"/>
               </w:rPr>
             </w:pPr>
-            <w:r>
-              <w:rPr>
-                <w:sz w:val="24"/>
-                <w:szCs w:val="24"/>
-              </w:rPr>
-              <w:t>3 Общая характеристика студента _______________________________</w:t>
-            </w:r>
-            <w:r>
-              <w:rPr>
-                <w:sz w:val="24"/>
-                <w:szCs w:val="24"/>
-              </w:rPr>
-              <w:t>____</w:t>
-            </w:r>
-          </w:p>
-          <w:p>
-            <w:pPr>
+          </w:p>
+          <w:p>
+            <w:pPr>
+              <w:spacing w:line="216" w:lineRule="auto"/>
               <w:jc w:val="both"/>
               <w:rPr>
                 <w:sz w:val="24"/>
@@ -833,18 +992,12 @@
                 <w:sz w:val="24"/>
                 <w:szCs w:val="24"/>
               </w:rPr>
-              <w:t>___________________________________________________________________________________________________________________________________________________________________________________________________</w:t>
-            </w:r>
-            <w:r>
-              <w:rPr>
-                <w:sz w:val="24"/>
-                <w:szCs w:val="24"/>
-              </w:rPr>
-              <w:t>_________________________________________________________________</w:t>
-            </w:r>
-          </w:p>
-          <w:p>
-            <w:pPr>
+              <w:t>Руководитель практики от профильной организации</w:t>
+            </w:r>
+          </w:p>
+          <w:p>
+            <w:pPr>
+              <w:spacing w:line="216" w:lineRule="auto"/>
               <w:jc w:val="both"/>
               <w:rPr>
                 <w:sz w:val="24"/>
@@ -856,209 +1009,24 @@
                 <w:sz w:val="24"/>
                 <w:szCs w:val="24"/>
               </w:rPr>
-              <w:t>_________________________________________________________________</w:t>
-            </w:r>
-          </w:p>
-          <w:p>
-            <w:pPr>
+              <w:t xml:space="preserve">____________________                                ________________________ </w:t>
+            </w:r>
+          </w:p>
+          <w:p>
+            <w:pPr>
+              <w:spacing w:line="216" w:lineRule="auto"/>
               <w:jc w:val="both"/>
               <w:rPr>
-                <w:sz w:val="24"/>
-                <w:szCs w:val="24"/>
-              </w:rPr>
-            </w:pPr>
-            <w:r>
-              <w:rPr>
-                <w:sz w:val="24"/>
-                <w:szCs w:val="24"/>
-              </w:rPr>
-              <w:t>4 Замечания _________________________________________________</w:t>
-            </w:r>
-            <w:r>
-              <w:rPr>
-                <w:sz w:val="24"/>
-                <w:szCs w:val="24"/>
-              </w:rPr>
-              <w:t>____</w:t>
-            </w:r>
-            <w:r>
-              <w:rPr>
-                <w:sz w:val="24"/>
-                <w:szCs w:val="24"/>
-              </w:rPr>
-              <w:t>_</w:t>
-            </w:r>
-          </w:p>
-          <w:p>
-            <w:pPr>
-              <w:jc w:val="both"/>
-              <w:rPr>
-                <w:sz w:val="24"/>
-                <w:szCs w:val="24"/>
-              </w:rPr>
-            </w:pPr>
-            <w:r>
-              <w:rPr>
-                <w:sz w:val="24"/>
-                <w:szCs w:val="24"/>
-              </w:rPr>
-              <w:t>______________________________________________________________________________________________________________________________________________________________________________________________</w:t>
-            </w:r>
-            <w:r>
-              <w:rPr>
-                <w:sz w:val="24"/>
-                <w:szCs w:val="24"/>
-              </w:rPr>
-              <w:t>_____</w:t>
-            </w:r>
-          </w:p>
-          <w:p>
-            <w:pPr>
-              <w:spacing w:line="216" w:lineRule="auto"/>
-              <w:jc w:val="both"/>
-              <w:rPr>
-                <w:sz w:val="24"/>
-                <w:szCs w:val="24"/>
-              </w:rPr>
-            </w:pPr>
-            <w:r>
-              <w:rPr>
-                <w:sz w:val="24"/>
-                <w:szCs w:val="24"/>
-              </w:rPr>
-              <w:t>5 Рекомендации _____________________________________________</w:t>
-            </w:r>
-            <w:r>
-              <w:rPr>
-                <w:sz w:val="24"/>
-                <w:szCs w:val="24"/>
-              </w:rPr>
-              <w:t>______</w:t>
-            </w:r>
-          </w:p>
-          <w:p>
-            <w:pPr>
-              <w:jc w:val="both"/>
-              <w:rPr>
-                <w:sz w:val="24"/>
-                <w:szCs w:val="24"/>
-              </w:rPr>
-            </w:pPr>
-            <w:r>
-              <w:rPr>
-                <w:sz w:val="24"/>
-                <w:szCs w:val="24"/>
-              </w:rPr>
-              <w:t>__________________________________________________________________________________________________________________________________</w:t>
-            </w:r>
-          </w:p>
-          <w:p>
-            <w:pPr>
-              <w:jc w:val="both"/>
-              <w:rPr>
-                <w:sz w:val="24"/>
-                <w:szCs w:val="24"/>
-              </w:rPr>
-            </w:pPr>
-            <w:r>
-              <w:rPr>
-                <w:sz w:val="24"/>
-                <w:szCs w:val="24"/>
-              </w:rPr>
-              <w:t>_________________________________________________________________</w:t>
-            </w:r>
-          </w:p>
-          <w:p>
-            <w:pPr>
-              <w:jc w:val="both"/>
-              <w:rPr>
-                <w:sz w:val="24"/>
-                <w:szCs w:val="24"/>
-              </w:rPr>
-            </w:pPr>
-            <w:r>
-              <w:rPr>
-                <w:sz w:val="24"/>
-                <w:szCs w:val="24"/>
-              </w:rPr>
-              <w:t>_________________________________________________________________</w:t>
-            </w:r>
-          </w:p>
-          <w:p>
-            <w:pPr>
-              <w:spacing w:line="216" w:lineRule="auto"/>
-              <w:jc w:val="both"/>
-              <w:rPr>
-                <w:sz w:val="24"/>
-                <w:szCs w:val="24"/>
-              </w:rPr>
-            </w:pPr>
-          </w:p>
-          <w:p>
-            <w:pPr>
-              <w:spacing w:line="216" w:lineRule="auto"/>
-              <w:jc w:val="both"/>
-              <w:rPr>
-                <w:sz w:val="24"/>
-                <w:szCs w:val="24"/>
-              </w:rPr>
-            </w:pPr>
-            <w:r>
-              <w:rPr>
-                <w:sz w:val="24"/>
-                <w:szCs w:val="24"/>
-              </w:rPr>
-              <w:t>Руководитель практики от профильной организации</w:t>
-            </w:r>
-          </w:p>
-          <w:p>
-            <w:pPr>
-              <w:spacing w:line="216" w:lineRule="auto"/>
-              <w:jc w:val="both"/>
-              <w:rPr>
-                <w:sz w:val="24"/>
-                <w:szCs w:val="24"/>
-              </w:rPr>
-            </w:pPr>
-            <w:r>
-              <w:rPr>
-                <w:sz w:val="24"/>
-                <w:szCs w:val="24"/>
-              </w:rPr>
-              <w:t xml:space="preserve">____________________                                ________________________ </w:t>
-            </w:r>
-          </w:p>
-          <w:p>
-            <w:pPr>
-              <w:spacing w:line="216" w:lineRule="auto"/>
-              <w:jc w:val="both"/>
-              <w:rPr>
-                <w:sz w:val="16"/>
-                <w:szCs w:val="16"/>
-              </w:rPr>
-            </w:pPr>
-            <w:r>
-              <w:rPr>
-                <w:sz w:val="16"/>
-                <w:szCs w:val="16"/>
-              </w:rPr>
-              <w:t xml:space="preserve">           (</w:t>
-            </w:r>
-            <w:proofErr w:type="gramStart"/>
-            <w:r>
-              <w:rPr>
-                <w:sz w:val="16"/>
-                <w:szCs w:val="16"/>
-              </w:rPr>
-              <w:t xml:space="preserve">должность)   </w:t>
-            </w:r>
-            <w:proofErr w:type="gramEnd"/>
-            <w:r>
-              <w:rPr>
-                <w:sz w:val="16"/>
-                <w:szCs w:val="16"/>
-              </w:rPr>
-              <w:t xml:space="preserve">                                   (Подпись)                                           (Инициалы, фамилия)</w:t>
+                <w:sz w:val="16"/>
+                <w:szCs w:val="16"/>
+              </w:rPr>
+            </w:pPr>
+            <w:r>
+              <w:rPr>
+                <w:sz w:val="16"/>
+                <w:szCs w:val="16"/>
+              </w:rPr>
+              <w:t xml:space="preserve">           (должность)                                      (Подпись)                                           (Инициалы, фамилия)</w:t>
             </w:r>
           </w:p>
           <w:p>
@@ -1334,23 +1302,7 @@
                 <w:bCs/>
                 <w:sz w:val="16"/>
               </w:rPr>
-              <w:t xml:space="preserve">Приказ № ______________ </w:t>
-            </w:r>
-            <w:proofErr w:type="gramStart"/>
-            <w:r>
-              <w:rPr>
-                <w:bCs/>
-                <w:sz w:val="16"/>
-              </w:rPr>
-              <w:t>от  _</w:t>
-            </w:r>
-            <w:proofErr w:type="gramEnd"/>
-            <w:r>
-              <w:rPr>
-                <w:bCs/>
-                <w:sz w:val="16"/>
-              </w:rPr>
-              <w:t>__________________</w:t>
+              <w:t>Приказ № ______________ от  ___________________</w:t>
             </w:r>
           </w:p>
           <w:p>
@@ -1450,7 +1402,6 @@
               </w:rPr>
               <w:t xml:space="preserve"> </w:t>
             </w:r>
-            <w:proofErr w:type="gramStart"/>
             <w:r>
               <w:rPr>
                 <w:b/>
@@ -1469,18 +1420,7 @@
                 <w:u w:val="single"/>
                 <w:lang w:val="en-US"/>
               </w:rPr>
-              <w:t>{</w:t>
-            </w:r>
-            <w:proofErr w:type="gramEnd"/>
-            <w:r>
-              <w:rPr>
-                <w:b/>
-                <w:sz w:val="24"/>
-                <w:szCs w:val="24"/>
-                <w:u w:val="single"/>
-                <w:lang w:val="en-US"/>
-              </w:rPr>
-              <w:t xml:space="preserve">{ </w:t>
+              <w:t xml:space="preserve">{{ </w:t>
             </w:r>
             <w:proofErr w:type="spellStart"/>
             <w:r>
@@ -1639,7 +1579,6 @@
               </w:rPr>
               <w:t>name</w:t>
             </w:r>
-            <w:proofErr w:type="gramStart"/>
             <w:r>
               <w:rPr>
                 <w:b/>
@@ -1655,20 +1594,296 @@
                 <w:sz w:val="22"/>
                 <w:szCs w:val="22"/>
               </w:rPr>
+              <w:t>___</w:t>
+            </w:r>
+            <w:r>
+              <w:rPr>
+                <w:b/>
+                <w:sz w:val="22"/>
+                <w:szCs w:val="22"/>
+              </w:rPr>
+              <w:t xml:space="preserve"> </w:t>
+            </w:r>
+            <w:r>
+              <w:rPr>
+                <w:sz w:val="22"/>
+                <w:szCs w:val="22"/>
+              </w:rPr>
+              <w:t xml:space="preserve"> по направлению (специальности) </w:t>
+            </w:r>
+            <w:r>
+              <w:rPr>
+                <w:sz w:val="22"/>
+                <w:szCs w:val="22"/>
+              </w:rPr>
+              <w:t>____________________________________________________________________</w:t>
+            </w:r>
+          </w:p>
+          <w:p>
+            <w:pPr>
+              <w:spacing w:line="216" w:lineRule="auto"/>
+              <w:rPr>
+                <w:sz w:val="22"/>
+                <w:szCs w:val="22"/>
+              </w:rPr>
+            </w:pPr>
+            <w:r>
+              <w:rPr>
+                <w:sz w:val="22"/>
+                <w:szCs w:val="22"/>
+              </w:rPr>
+              <w:t>____________________________________________________________________</w:t>
+            </w:r>
+          </w:p>
+          <w:p>
+            <w:pPr>
+              <w:spacing w:line="216" w:lineRule="auto"/>
+              <w:rPr>
+                <w:sz w:val="22"/>
+                <w:szCs w:val="22"/>
+              </w:rPr>
+            </w:pPr>
+            <w:r>
+              <w:rPr>
+                <w:sz w:val="22"/>
+                <w:szCs w:val="22"/>
+              </w:rPr>
+              <w:t>____________________________________________________________________</w:t>
+            </w:r>
+          </w:p>
+          <w:p>
+            <w:pPr>
+              <w:spacing w:line="216" w:lineRule="auto"/>
+              <w:rPr>
+                <w:sz w:val="22"/>
+                <w:szCs w:val="22"/>
+              </w:rPr>
+            </w:pPr>
+            <w:r>
+              <w:rPr>
+                <w:sz w:val="22"/>
+                <w:szCs w:val="22"/>
+              </w:rPr>
+              <w:t xml:space="preserve">направляется для прохождения </w:t>
+            </w:r>
+            <w:r>
+              <w:rPr>
+                <w:sz w:val="22"/>
+                <w:szCs w:val="22"/>
+              </w:rPr>
+              <w:t xml:space="preserve">производственной </w:t>
+            </w:r>
+            <w:r>
+              <w:rPr>
+                <w:sz w:val="22"/>
+                <w:szCs w:val="22"/>
+              </w:rPr>
+              <w:t xml:space="preserve"> практики в (на)</w:t>
+            </w:r>
+          </w:p>
+          <w:p>
+            <w:pPr>
+              <w:spacing w:line="216" w:lineRule="auto"/>
+              <w:rPr>
+                <w:sz w:val="22"/>
+                <w:szCs w:val="22"/>
+              </w:rPr>
+            </w:pPr>
+            <w:r>
+              <w:rPr>
+                <w:sz w:val="22"/>
+                <w:szCs w:val="22"/>
+                <w:vertAlign w:val="superscript"/>
+              </w:rPr>
+              <w:t xml:space="preserve">                                                                                                            (вид (тип) практики)</w:t>
+            </w:r>
+            <w:r>
+              <w:rPr>
+                <w:sz w:val="22"/>
+                <w:szCs w:val="22"/>
+              </w:rPr>
+              <w:t xml:space="preserve"> </w:t>
+            </w:r>
+          </w:p>
+          <w:p>
+            <w:pPr>
+              <w:spacing w:line="216" w:lineRule="auto"/>
+              <w:rPr>
+                <w:b/>
+                <w:sz w:val="22"/>
+                <w:szCs w:val="22"/>
+              </w:rPr>
+            </w:pPr>
+            <w:r>
+              <w:rPr>
+                <w:b/>
+                <w:sz w:val="22"/>
+                <w:szCs w:val="22"/>
+              </w:rPr>
+              <w:t>___________________________________________________</w:t>
+            </w:r>
+          </w:p>
+          <w:p>
+            <w:pPr>
+              <w:spacing w:line="216" w:lineRule="auto"/>
+              <w:rPr>
+                <w:sz w:val="22"/>
+                <w:szCs w:val="22"/>
+                <w:vertAlign w:val="superscript"/>
+              </w:rPr>
+            </w:pPr>
+            <w:r>
+              <w:rPr>
+                <w:sz w:val="22"/>
+                <w:szCs w:val="22"/>
+                <w:vertAlign w:val="superscript"/>
+              </w:rPr>
+              <w:t xml:space="preserve">                                                      (наименование предприятия, организации, учреждения)</w:t>
+            </w:r>
+          </w:p>
+          <w:p>
+            <w:pPr>
+              <w:spacing w:line="216" w:lineRule="auto"/>
+              <w:rPr>
+                <w:sz w:val="22"/>
+                <w:szCs w:val="22"/>
+              </w:rPr>
+            </w:pPr>
+            <w:r>
+              <w:rPr>
+                <w:sz w:val="22"/>
+                <w:szCs w:val="22"/>
+              </w:rPr>
+              <w:t>в _________________________________________________</w:t>
+            </w:r>
+          </w:p>
+          <w:p>
+            <w:pPr>
+              <w:spacing w:line="216" w:lineRule="auto"/>
+              <w:rPr>
+                <w:sz w:val="22"/>
+                <w:szCs w:val="22"/>
+              </w:rPr>
+            </w:pPr>
+          </w:p>
+          <w:p>
+            <w:pPr>
+              <w:spacing w:line="216" w:lineRule="auto"/>
+              <w:rPr>
+                <w:sz w:val="22"/>
+                <w:szCs w:val="22"/>
+              </w:rPr>
+            </w:pPr>
+            <w:r>
+              <w:rPr>
+                <w:sz w:val="22"/>
+                <w:szCs w:val="22"/>
+              </w:rPr>
+              <w:t>Срок</w:t>
+            </w:r>
+            <w:r>
+              <w:rPr>
+                <w:sz w:val="22"/>
+                <w:szCs w:val="22"/>
+              </w:rPr>
+              <w:t xml:space="preserve"> </w:t>
+            </w:r>
+            <w:r>
+              <w:rPr>
+                <w:sz w:val="22"/>
+                <w:szCs w:val="22"/>
+              </w:rPr>
+              <w:t>практики</w:t>
+            </w:r>
+            <w:r>
+              <w:rPr>
+                <w:sz w:val="22"/>
+                <w:szCs w:val="22"/>
+              </w:rPr>
+              <w:t xml:space="preserve">: </w:t>
+            </w:r>
+            <w:r>
+              <w:rPr>
+                <w:sz w:val="22"/>
+                <w:szCs w:val="22"/>
+              </w:rPr>
+              <w:t>с</w:t>
+            </w:r>
+            <w:r>
+              <w:rPr>
+                <w:sz w:val="22"/>
+                <w:szCs w:val="22"/>
+              </w:rPr>
+              <w:t xml:space="preserve"> </w:t>
+            </w:r>
+            <w:r>
+              <w:rPr>
+                <w:sz w:val="22"/>
+                <w:szCs w:val="22"/>
+                <w:u w:val="single"/>
+              </w:rPr>
+              <w:t xml:space="preserve">{{ </w:t>
+            </w:r>
+            <w:r>
+              <w:rPr>
+                <w:sz w:val="22"/>
+                <w:szCs w:val="22"/>
+                <w:u w:val="single"/>
+                <w:lang w:val="en-US"/>
+              </w:rPr>
+              <w:t>practice</w:t>
+            </w:r>
+            <w:r>
+              <w:rPr>
+                <w:sz w:val="22"/>
+                <w:szCs w:val="22"/>
+                <w:u w:val="single"/>
+              </w:rPr>
               <w:t>_</w:t>
             </w:r>
-            <w:proofErr w:type="gramEnd"/>
-            <w:r>
-              <w:rPr>
-                <w:b/>
-                <w:sz w:val="22"/>
-                <w:szCs w:val="22"/>
-              </w:rPr>
-              <w:t>__</w:t>
-            </w:r>
-            <w:r>
-              <w:rPr>
-                <w:b/>
+            <w:r>
+              <w:rPr>
+                <w:sz w:val="22"/>
+                <w:szCs w:val="22"/>
+                <w:u w:val="single"/>
+                <w:lang w:val="en-US"/>
+              </w:rPr>
+              <w:t>start</w:t>
+            </w:r>
+            <w:r>
+              <w:rPr>
+                <w:sz w:val="22"/>
+                <w:szCs w:val="22"/>
+                <w:u w:val="single"/>
+              </w:rPr>
+              <w:t>_</w:t>
+            </w:r>
+            <w:r>
+              <w:rPr>
+                <w:sz w:val="22"/>
+                <w:szCs w:val="22"/>
+                <w:u w:val="single"/>
+                <w:lang w:val="en-US"/>
+              </w:rPr>
+              <w:t>date</w:t>
+            </w:r>
+            <w:r>
+              <w:rPr>
+                <w:sz w:val="22"/>
+                <w:szCs w:val="22"/>
+                <w:u w:val="single"/>
+              </w:rPr>
+              <w:t xml:space="preserve"> }}</w:t>
+            </w:r>
+            <w:r>
+              <w:rPr>
+                <w:sz w:val="22"/>
+                <w:szCs w:val="22"/>
+              </w:rPr>
+              <w:t>по</w:t>
+            </w:r>
+            <w:r>
+              <w:rPr>
                 <w:sz w:val="22"/>
                 <w:szCs w:val="22"/>
               </w:rPr>
@@ -1678,103 +1893,102 @@
               <w:rPr>
                 <w:sz w:val="22"/>
                 <w:szCs w:val="22"/>
-              </w:rPr>
-              <w:t xml:space="preserve"> по направлению (специальности) </w:t>
-            </w:r>
-            <w:r>
-              <w:rPr>
-                <w:sz w:val="22"/>
-                <w:szCs w:val="22"/>
-              </w:rPr>
-              <w:t>____________________________________________________________________</w:t>
-            </w:r>
-          </w:p>
-          <w:p>
-            <w:pPr>
-              <w:spacing w:line="216" w:lineRule="auto"/>
-              <w:rPr>
-                <w:sz w:val="22"/>
-                <w:szCs w:val="22"/>
-              </w:rPr>
-            </w:pPr>
-            <w:r>
-              <w:rPr>
-                <w:sz w:val="22"/>
-                <w:szCs w:val="22"/>
-              </w:rPr>
-              <w:t>____________________________________________________________________</w:t>
-            </w:r>
-          </w:p>
-          <w:p>
-            <w:pPr>
-              <w:spacing w:line="216" w:lineRule="auto"/>
-              <w:rPr>
-                <w:sz w:val="22"/>
-                <w:szCs w:val="22"/>
-              </w:rPr>
-            </w:pPr>
-            <w:r>
-              <w:rPr>
-                <w:sz w:val="22"/>
-                <w:szCs w:val="22"/>
-              </w:rPr>
-              <w:t>____________________________________________________________________</w:t>
-            </w:r>
-          </w:p>
-          <w:p>
-            <w:pPr>
-              <w:spacing w:line="216" w:lineRule="auto"/>
-              <w:rPr>
-                <w:sz w:val="22"/>
-                <w:szCs w:val="22"/>
-              </w:rPr>
-            </w:pPr>
-            <w:r>
-              <w:rPr>
-                <w:sz w:val="22"/>
-                <w:szCs w:val="22"/>
-              </w:rPr>
-              <w:t xml:space="preserve">направляется для прохождения </w:t>
-            </w:r>
-            <w:proofErr w:type="gramStart"/>
-            <w:r>
-              <w:rPr>
-                <w:sz w:val="22"/>
-                <w:szCs w:val="22"/>
-              </w:rPr>
-              <w:t xml:space="preserve">производственной </w:t>
-            </w:r>
-            <w:r>
-              <w:rPr>
-                <w:sz w:val="22"/>
-                <w:szCs w:val="22"/>
-              </w:rPr>
-              <w:t xml:space="preserve"> практики</w:t>
-            </w:r>
-            <w:proofErr w:type="gramEnd"/>
-            <w:r>
-              <w:rPr>
-                <w:sz w:val="22"/>
-                <w:szCs w:val="22"/>
-              </w:rPr>
-              <w:t xml:space="preserve"> в (на)</w:t>
-            </w:r>
-          </w:p>
-          <w:p>
-            <w:pPr>
-              <w:spacing w:line="216" w:lineRule="auto"/>
-              <w:rPr>
-                <w:sz w:val="22"/>
-                <w:szCs w:val="22"/>
-              </w:rPr>
-            </w:pPr>
-            <w:r>
-              <w:rPr>
-                <w:sz w:val="22"/>
-                <w:szCs w:val="22"/>
+                <w:u w:val="single"/>
+              </w:rPr>
+              <w:t xml:space="preserve">{{ </w:t>
+            </w:r>
+            <w:r>
+              <w:rPr>
+                <w:sz w:val="22"/>
+                <w:szCs w:val="22"/>
+                <w:u w:val="single"/>
+                <w:lang w:val="en-US"/>
+              </w:rPr>
+              <w:t>practice</w:t>
+            </w:r>
+            <w:r>
+              <w:rPr>
+                <w:sz w:val="22"/>
+                <w:szCs w:val="22"/>
+                <w:u w:val="single"/>
+              </w:rPr>
+              <w:t>_</w:t>
+            </w:r>
+            <w:r>
+              <w:rPr>
+                <w:sz w:val="22"/>
+                <w:szCs w:val="22"/>
+                <w:u w:val="single"/>
+                <w:lang w:val="en-US"/>
+              </w:rPr>
+              <w:t>end</w:t>
+            </w:r>
+            <w:r>
+              <w:rPr>
+                <w:sz w:val="22"/>
+                <w:szCs w:val="22"/>
+                <w:u w:val="single"/>
+              </w:rPr>
+              <w:t>_</w:t>
+            </w:r>
+            <w:r>
+              <w:rPr>
+                <w:sz w:val="22"/>
+                <w:szCs w:val="22"/>
+                <w:u w:val="single"/>
+                <w:lang w:val="en-US"/>
+              </w:rPr>
+              <w:t>date</w:t>
+            </w:r>
+            <w:r>
+              <w:rPr>
+                <w:sz w:val="22"/>
+                <w:szCs w:val="22"/>
+                <w:u w:val="single"/>
+              </w:rPr>
+              <w:t xml:space="preserve"> }}</w:t>
+            </w:r>
+          </w:p>
+          <w:p>
+            <w:pPr>
+              <w:spacing w:line="216" w:lineRule="auto"/>
+              <w:rPr>
+                <w:sz w:val="24"/>
+                <w:szCs w:val="24"/>
                 <w:vertAlign w:val="superscript"/>
               </w:rPr>
-              <w:t xml:space="preserve">                                                                                                            (вид (тип) практики)</w:t>
+            </w:pPr>
+            <w:r>
+              <w:rPr>
+                <w:sz w:val="24"/>
+                <w:szCs w:val="24"/>
+                <w:vertAlign w:val="superscript"/>
+              </w:rPr>
+              <w:t xml:space="preserve">                                          </w:t>
+            </w:r>
+            <w:r>
+              <w:rPr>
+                <w:sz w:val="24"/>
+                <w:szCs w:val="24"/>
+                <w:vertAlign w:val="superscript"/>
+              </w:rPr>
+              <w:t>(дата)                                   (дата)</w:t>
+            </w:r>
+          </w:p>
+          <w:p>
+            <w:pPr>
+              <w:spacing w:line="216" w:lineRule="auto"/>
+              <w:rPr>
+                <w:sz w:val="22"/>
+                <w:szCs w:val="22"/>
+              </w:rPr>
+            </w:pPr>
+            <w:r>
+              <w:rPr>
+                <w:sz w:val="22"/>
+                <w:szCs w:val="22"/>
+              </w:rPr>
+              <w:t xml:space="preserve">Начальник отдела </w:t>
             </w:r>
             <w:r>
               <w:rPr>
@@ -1788,18 +2002,44 @@
             <w:pPr>
               <w:spacing w:line="216" w:lineRule="auto"/>
               <w:rPr>
-                <w:b/>
-                <w:sz w:val="22"/>
-                <w:szCs w:val="22"/>
-              </w:rPr>
-            </w:pPr>
-            <w:r>
-              <w:rPr>
-                <w:b/>
-                <w:sz w:val="22"/>
-                <w:szCs w:val="22"/>
-              </w:rPr>
-              <w:t>___________________________________________________</w:t>
+                <w:sz w:val="22"/>
+                <w:szCs w:val="22"/>
+              </w:rPr>
+            </w:pPr>
+            <w:r>
+              <w:rPr>
+                <w:sz w:val="22"/>
+                <w:szCs w:val="22"/>
+              </w:rPr>
+              <w:t>практической подготовки и мобильности</w:t>
+            </w:r>
+            <w:r>
+              <w:rPr>
+                <w:sz w:val="22"/>
+                <w:szCs w:val="22"/>
+              </w:rPr>
+              <w:t xml:space="preserve">               </w:t>
+            </w:r>
+            <w:r>
+              <w:rPr>
+                <w:sz w:val="22"/>
+                <w:szCs w:val="22"/>
+              </w:rPr>
+              <w:t xml:space="preserve">      </w:t>
+            </w:r>
+            <w:r>
+              <w:rPr>
+                <w:sz w:val="22"/>
+                <w:szCs w:val="22"/>
+              </w:rPr>
+              <w:t xml:space="preserve"> _______</w:t>
+            </w:r>
+            <w:r>
+              <w:rPr>
+                <w:sz w:val="22"/>
+                <w:szCs w:val="22"/>
+              </w:rPr>
+              <w:t>______________</w:t>
             </w:r>
           </w:p>
           <w:p>
@@ -1817,300 +2057,6 @@
                 <w:szCs w:val="22"/>
                 <w:vertAlign w:val="superscript"/>
               </w:rPr>
-              <w:t xml:space="preserve">                                                      (наименование предприятия, организации, учреждения)</w:t>
-            </w:r>
-          </w:p>
-          <w:p>
-            <w:pPr>
-              <w:spacing w:line="216" w:lineRule="auto"/>
-              <w:rPr>
-                <w:sz w:val="22"/>
-                <w:szCs w:val="22"/>
-              </w:rPr>
-            </w:pPr>
-            <w:r>
-              <w:rPr>
-                <w:sz w:val="22"/>
-                <w:szCs w:val="22"/>
-              </w:rPr>
-              <w:t>в _________________________________________________</w:t>
-            </w:r>
-          </w:p>
-          <w:p>
-            <w:pPr>
-              <w:spacing w:line="216" w:lineRule="auto"/>
-              <w:rPr>
-                <w:sz w:val="22"/>
-                <w:szCs w:val="22"/>
-              </w:rPr>
-            </w:pPr>
-          </w:p>
-          <w:p>
-            <w:pPr>
-              <w:spacing w:line="216" w:lineRule="auto"/>
-              <w:rPr>
-                <w:sz w:val="22"/>
-                <w:szCs w:val="22"/>
-                <w:lang w:val="en-US"/>
-              </w:rPr>
-            </w:pPr>
-            <w:r>
-              <w:rPr>
-                <w:sz w:val="22"/>
-                <w:szCs w:val="22"/>
-              </w:rPr>
-              <w:t>Срок</w:t>
-            </w:r>
-            <w:r>
-              <w:rPr>
-                <w:sz w:val="22"/>
-                <w:szCs w:val="22"/>
-                <w:lang w:val="en-US"/>
-              </w:rPr>
-              <w:t xml:space="preserve"> </w:t>
-            </w:r>
-            <w:r>
-              <w:rPr>
-                <w:sz w:val="22"/>
-                <w:szCs w:val="22"/>
-              </w:rPr>
-              <w:t>практики</w:t>
-            </w:r>
-            <w:r>
-              <w:rPr>
-                <w:sz w:val="22"/>
-                <w:szCs w:val="22"/>
-                <w:lang w:val="en-US"/>
-              </w:rPr>
-              <w:t xml:space="preserve">: </w:t>
-            </w:r>
-            <w:r>
-              <w:rPr>
-                <w:sz w:val="22"/>
-                <w:szCs w:val="22"/>
-              </w:rPr>
-              <w:t>с</w:t>
-            </w:r>
-            <w:r>
-              <w:rPr>
-                <w:sz w:val="22"/>
-                <w:szCs w:val="22"/>
-                <w:lang w:val="en-US"/>
-              </w:rPr>
-              <w:t xml:space="preserve"> </w:t>
-            </w:r>
-            <w:proofErr w:type="gramStart"/>
-            <w:r>
-              <w:rPr>
-                <w:sz w:val="22"/>
-                <w:szCs w:val="22"/>
-                <w:u w:val="single"/>
-                <w:lang w:val="en-US"/>
-              </w:rPr>
-              <w:t xml:space="preserve">{{ </w:t>
-            </w:r>
-            <w:proofErr w:type="spellStart"/>
-            <w:r>
-              <w:rPr>
-                <w:sz w:val="22"/>
-                <w:szCs w:val="22"/>
-                <w:u w:val="single"/>
-                <w:lang w:val="en-US"/>
-              </w:rPr>
-              <w:t>practice</w:t>
-            </w:r>
-            <w:proofErr w:type="gramEnd"/>
-            <w:r>
-              <w:rPr>
-                <w:sz w:val="22"/>
-                <w:szCs w:val="22"/>
-                <w:u w:val="single"/>
-                <w:lang w:val="en-US"/>
-              </w:rPr>
-              <w:t>_start_date</w:t>
-            </w:r>
-            <w:proofErr w:type="spellEnd"/>
-            <w:r>
-              <w:rPr>
-                <w:sz w:val="22"/>
-                <w:szCs w:val="22"/>
-                <w:u w:val="single"/>
-                <w:lang w:val="en-US"/>
-              </w:rPr>
-              <w:t xml:space="preserve"> }}</w:t>
-            </w:r>
-            <w:r>
-              <w:rPr>
-                <w:sz w:val="22"/>
-                <w:szCs w:val="22"/>
-              </w:rPr>
-              <w:t>по</w:t>
-            </w:r>
-            <w:r>
-              <w:rPr>
-                <w:sz w:val="22"/>
-                <w:szCs w:val="22"/>
-                <w:lang w:val="en-US"/>
-              </w:rPr>
-              <w:t xml:space="preserve"> </w:t>
-            </w:r>
-            <w:r>
-              <w:rPr>
-                <w:sz w:val="22"/>
-                <w:szCs w:val="22"/>
-                <w:u w:val="single"/>
-                <w:lang w:val="en-US"/>
-              </w:rPr>
-              <w:t xml:space="preserve">{{ </w:t>
-            </w:r>
-            <w:proofErr w:type="spellStart"/>
-            <w:r>
-              <w:rPr>
-                <w:sz w:val="22"/>
-                <w:szCs w:val="22"/>
-                <w:u w:val="single"/>
-                <w:lang w:val="en-US"/>
-              </w:rPr>
-              <w:t>practice_end_date</w:t>
-            </w:r>
-            <w:proofErr w:type="spellEnd"/>
-            <w:r>
-              <w:rPr>
-                <w:sz w:val="22"/>
-                <w:szCs w:val="22"/>
-                <w:u w:val="single"/>
-                <w:lang w:val="en-US"/>
-              </w:rPr>
-              <w:t xml:space="preserve"> }}</w:t>
-            </w:r>
-          </w:p>
-          <w:p>
-            <w:pPr>
-              <w:spacing w:line="216" w:lineRule="auto"/>
-              <w:rPr>
-                <w:sz w:val="24"/>
-                <w:szCs w:val="24"/>
-                <w:vertAlign w:val="superscript"/>
-              </w:rPr>
-            </w:pPr>
-            <w:r>
-              <w:rPr>
-                <w:sz w:val="24"/>
-                <w:szCs w:val="24"/>
-                <w:vertAlign w:val="superscript"/>
-                <w:lang w:val="en-US"/>
-              </w:rPr>
-              <w:t xml:space="preserve">                                          </w:t>
-            </w:r>
-            <w:r>
-              <w:rPr>
-                <w:sz w:val="24"/>
-                <w:szCs w:val="24"/>
-                <w:vertAlign w:val="superscript"/>
-              </w:rPr>
-              <w:t>(</w:t>
-            </w:r>
-            <w:proofErr w:type="gramStart"/>
-            <w:r>
-              <w:rPr>
-                <w:sz w:val="24"/>
-                <w:szCs w:val="24"/>
-                <w:vertAlign w:val="superscript"/>
-              </w:rPr>
-              <w:t xml:space="preserve">дата)   </w:t>
-            </w:r>
-            <w:proofErr w:type="gramEnd"/>
-            <w:r>
-              <w:rPr>
-                <w:sz w:val="24"/>
-                <w:szCs w:val="24"/>
-                <w:vertAlign w:val="superscript"/>
-              </w:rPr>
-              <w:t xml:space="preserve">                                (дата)</w:t>
-            </w:r>
-          </w:p>
-          <w:p>
-            <w:pPr>
-              <w:spacing w:line="216" w:lineRule="auto"/>
-              <w:rPr>
-                <w:sz w:val="22"/>
-                <w:szCs w:val="22"/>
-              </w:rPr>
-            </w:pPr>
-            <w:r>
-              <w:rPr>
-                <w:sz w:val="22"/>
-                <w:szCs w:val="22"/>
-              </w:rPr>
-              <w:t xml:space="preserve">Начальник отдела </w:t>
-            </w:r>
-            <w:r>
-              <w:rPr>
-                <w:sz w:val="22"/>
-                <w:szCs w:val="22"/>
-              </w:rPr>
-              <w:t xml:space="preserve"> </w:t>
-            </w:r>
-          </w:p>
-          <w:p>
-            <w:pPr>
-              <w:spacing w:line="216" w:lineRule="auto"/>
-              <w:rPr>
-                <w:sz w:val="22"/>
-                <w:szCs w:val="22"/>
-              </w:rPr>
-            </w:pPr>
-            <w:r>
-              <w:rPr>
-                <w:sz w:val="22"/>
-                <w:szCs w:val="22"/>
-              </w:rPr>
-              <w:t>практической подготовки и мобильности</w:t>
-            </w:r>
-            <w:r>
-              <w:rPr>
-                <w:sz w:val="22"/>
-                <w:szCs w:val="22"/>
-              </w:rPr>
-              <w:t xml:space="preserve">               </w:t>
-            </w:r>
-            <w:r>
-              <w:rPr>
-                <w:sz w:val="22"/>
-                <w:szCs w:val="22"/>
-              </w:rPr>
-              <w:t xml:space="preserve">      </w:t>
-            </w:r>
-            <w:r>
-              <w:rPr>
-                <w:sz w:val="22"/>
-                <w:szCs w:val="22"/>
-              </w:rPr>
-              <w:t xml:space="preserve"> _______</w:t>
-            </w:r>
-            <w:r>
-              <w:rPr>
-                <w:sz w:val="22"/>
-                <w:szCs w:val="22"/>
-              </w:rPr>
-              <w:t>______________</w:t>
-            </w:r>
-          </w:p>
-          <w:p>
-            <w:pPr>
-              <w:spacing w:line="216" w:lineRule="auto"/>
-              <w:rPr>
-                <w:sz w:val="22"/>
-                <w:szCs w:val="22"/>
-                <w:vertAlign w:val="superscript"/>
-              </w:rPr>
-            </w:pPr>
-            <w:r>
-              <w:rPr>
-                <w:sz w:val="22"/>
-                <w:szCs w:val="22"/>
-                <w:vertAlign w:val="superscript"/>
-              </w:rPr>
               <w:t xml:space="preserve">                                                                                                                                                                 (инициалы, фамилия)</w:t>
             </w:r>
           </w:p>
@@ -2122,7 +2068,6 @@
                 <w:szCs w:val="22"/>
               </w:rPr>
             </w:pPr>
-            <w:proofErr w:type="gramStart"/>
             <w:r>
               <w:rPr>
                 <w:sz w:val="22"/>
@@ -2135,15 +2080,7 @@
                 <w:sz w:val="22"/>
                 <w:szCs w:val="22"/>
               </w:rPr>
-              <w:t>(</w:t>
-            </w:r>
-            <w:proofErr w:type="gramEnd"/>
-            <w:r>
-              <w:rPr>
-                <w:sz w:val="22"/>
-                <w:szCs w:val="22"/>
-              </w:rPr>
-              <w:t>директор)</w:t>
+              <w:t>(директор)</w:t>
             </w:r>
             <w:r>
               <w:rPr>
@@ -2289,25 +2226,7 @@
                 <w:szCs w:val="22"/>
                 <w:vertAlign w:val="superscript"/>
               </w:rPr>
-              <w:t xml:space="preserve">                                                                            (</w:t>
-            </w:r>
-            <w:proofErr w:type="gramStart"/>
-            <w:r>
-              <w:rPr>
-                <w:sz w:val="22"/>
-                <w:szCs w:val="22"/>
-                <w:vertAlign w:val="superscript"/>
-              </w:rPr>
-              <w:t xml:space="preserve">дата)   </w:t>
-            </w:r>
-            <w:proofErr w:type="gramEnd"/>
-            <w:r>
-              <w:rPr>
-                <w:sz w:val="22"/>
-                <w:szCs w:val="22"/>
-                <w:vertAlign w:val="superscript"/>
-              </w:rPr>
-              <w:t xml:space="preserve">                                                                                            (дата)</w:t>
+              <w:t xml:space="preserve">                                                                            (дата)                                                                                               (дата)</w:t>
             </w:r>
           </w:p>
           <w:p>
@@ -2355,23 +2274,7 @@
                 <w:sz w:val="12"/>
                 <w:szCs w:val="12"/>
               </w:rPr>
-              <w:t xml:space="preserve">                              (наименование кадровой </w:t>
-            </w:r>
-            <w:proofErr w:type="gramStart"/>
-            <w:r>
-              <w:rPr>
-                <w:sz w:val="12"/>
-                <w:szCs w:val="12"/>
-              </w:rPr>
-              <w:t xml:space="preserve">службы)   </w:t>
-            </w:r>
-            <w:proofErr w:type="gramEnd"/>
-            <w:r>
-              <w:rPr>
-                <w:sz w:val="12"/>
-                <w:szCs w:val="12"/>
-              </w:rPr>
-              <w:t xml:space="preserve">                                                               (наименование кадровой службы)</w:t>
+              <w:t xml:space="preserve">                              (наименование кадровой службы)                                                                  (наименование кадровой службы)</w:t>
             </w:r>
           </w:p>
           <w:p>
@@ -2414,25 +2317,7 @@
                 <w:szCs w:val="22"/>
                 <w:vertAlign w:val="superscript"/>
               </w:rPr>
-              <w:t xml:space="preserve">       (</w:t>
-            </w:r>
-            <w:proofErr w:type="gramStart"/>
-            <w:r>
-              <w:rPr>
-                <w:sz w:val="22"/>
-                <w:szCs w:val="22"/>
-                <w:vertAlign w:val="superscript"/>
-              </w:rPr>
-              <w:t xml:space="preserve">подпись)   </w:t>
-            </w:r>
-            <w:proofErr w:type="gramEnd"/>
-            <w:r>
-              <w:rPr>
-                <w:sz w:val="22"/>
-                <w:szCs w:val="22"/>
-                <w:vertAlign w:val="superscript"/>
-              </w:rPr>
-              <w:t xml:space="preserve">              (инициалы, фамилия)                                    (подпись)                      (инициалы, фамилия)  </w:t>
+              <w:t xml:space="preserve">       (подпись)                 (инициалы, фамилия)                                    (подпись)                      (инициалы, фамилия)  </w:t>
             </w:r>
           </w:p>
           <w:p>
@@ -2487,7 +2372,6 @@
                 <w:szCs w:val="20"/>
               </w:rPr>
             </w:pPr>
-            <w:proofErr w:type="gramStart"/>
             <w:r>
               <w:rPr>
                 <w:sz w:val="24"/>
@@ -2501,268 +2385,262 @@
                 <w:sz w:val="20"/>
                 <w:szCs w:val="20"/>
               </w:rPr>
+              <w:t>__________________________________________________________</w:t>
+            </w:r>
+          </w:p>
+          <w:p>
+            <w:pPr>
+              <w:jc w:val="center"/>
+              <w:rPr>
+                <w:b/>
+                <w:sz w:val="24"/>
+                <w:szCs w:val="24"/>
+              </w:rPr>
+            </w:pPr>
+            <w:r>
+              <w:rPr>
+                <w:b/>
+                <w:sz w:val="24"/>
+                <w:szCs w:val="24"/>
+              </w:rPr>
+              <w:t xml:space="preserve">ИНДИВИДУАЛЬНОЕ ЗАДАНИЕ </w:t>
+            </w:r>
+          </w:p>
+          <w:p>
+            <w:pPr>
+              <w:jc w:val="center"/>
+              <w:rPr>
+                <w:sz w:val="24"/>
+                <w:szCs w:val="24"/>
+              </w:rPr>
+            </w:pPr>
+            <w:r>
+              <w:rPr>
+                <w:sz w:val="24"/>
+                <w:szCs w:val="24"/>
+              </w:rPr>
+              <w:t>на ___________________ практику</w:t>
+            </w:r>
+          </w:p>
+          <w:p>
+            <w:pPr>
+              <w:jc w:val="both"/>
+              <w:rPr>
+                <w:sz w:val="24"/>
+                <w:szCs w:val="24"/>
+              </w:rPr>
+            </w:pPr>
+          </w:p>
+          <w:p>
+            <w:pPr>
+              <w:jc w:val="both"/>
+              <w:rPr>
+                <w:sz w:val="24"/>
+                <w:szCs w:val="24"/>
+              </w:rPr>
+            </w:pPr>
+            <w:r>
+              <w:rPr>
+                <w:sz w:val="24"/>
+                <w:szCs w:val="24"/>
+              </w:rPr>
+              <w:t>Студент</w:t>
+            </w:r>
+            <w:r>
+              <w:rPr>
+                <w:sz w:val="24"/>
+                <w:szCs w:val="24"/>
+              </w:rPr>
+              <w:t xml:space="preserve"> </w:t>
+            </w:r>
+            <w:r>
+              <w:rPr>
+                <w:b/>
+                <w:sz w:val="24"/>
+                <w:szCs w:val="24"/>
+                <w:u w:val="single"/>
+              </w:rPr>
+              <w:t>__</w:t>
+            </w:r>
+            <w:r>
+              <w:rPr>
+                <w:b/>
+                <w:sz w:val="24"/>
+                <w:szCs w:val="24"/>
+                <w:u w:val="single"/>
+              </w:rPr>
+              <w:t xml:space="preserve">{{ </w:t>
+            </w:r>
+            <w:r>
+              <w:rPr>
+                <w:b/>
+                <w:sz w:val="24"/>
+                <w:szCs w:val="24"/>
+                <w:u w:val="single"/>
+                <w:lang w:val="en-US"/>
+              </w:rPr>
+              <w:t>student</w:t>
+            </w:r>
+            <w:r>
+              <w:rPr>
+                <w:b/>
+                <w:sz w:val="24"/>
+                <w:szCs w:val="24"/>
+                <w:u w:val="single"/>
+              </w:rPr>
               <w:t>_</w:t>
             </w:r>
-            <w:proofErr w:type="gramEnd"/>
-            <w:r>
-              <w:rPr>
-                <w:sz w:val="20"/>
-                <w:szCs w:val="20"/>
-              </w:rPr>
-              <w:t>_________________________________________________________</w:t>
-            </w:r>
-          </w:p>
-          <w:p>
-            <w:pPr>
-              <w:jc w:val="center"/>
-              <w:rPr>
-                <w:b/>
-                <w:sz w:val="24"/>
-                <w:szCs w:val="24"/>
-              </w:rPr>
-            </w:pPr>
-            <w:r>
-              <w:rPr>
-                <w:b/>
-                <w:sz w:val="24"/>
-                <w:szCs w:val="24"/>
-              </w:rPr>
-              <w:t xml:space="preserve">ИНДИВИДУАЛЬНОЕ ЗАДАНИЕ </w:t>
-            </w:r>
-          </w:p>
-          <w:p>
-            <w:pPr>
-              <w:jc w:val="center"/>
-              <w:rPr>
-                <w:sz w:val="24"/>
-                <w:szCs w:val="24"/>
-              </w:rPr>
-            </w:pPr>
-            <w:r>
-              <w:rPr>
-                <w:sz w:val="24"/>
-                <w:szCs w:val="24"/>
-              </w:rPr>
-              <w:t>на ___________________ практику</w:t>
-            </w:r>
-          </w:p>
-          <w:p>
-            <w:pPr>
-              <w:jc w:val="both"/>
-              <w:rPr>
-                <w:sz w:val="24"/>
-                <w:szCs w:val="24"/>
-              </w:rPr>
-            </w:pPr>
-          </w:p>
-          <w:p>
-            <w:pPr>
-              <w:jc w:val="both"/>
-              <w:rPr>
-                <w:sz w:val="24"/>
-                <w:szCs w:val="24"/>
-                <w:lang w:val="en-US"/>
-              </w:rPr>
-            </w:pPr>
-            <w:r>
-              <w:rPr>
-                <w:sz w:val="24"/>
-                <w:szCs w:val="24"/>
-              </w:rPr>
-              <w:t>Студент</w:t>
-            </w:r>
-            <w:r>
-              <w:rPr>
-                <w:sz w:val="24"/>
-                <w:szCs w:val="24"/>
-                <w:lang w:val="en-US"/>
+            <w:r>
+              <w:rPr>
+                <w:b/>
+                <w:sz w:val="24"/>
+                <w:szCs w:val="24"/>
+                <w:u w:val="single"/>
+                <w:lang w:val="en-US"/>
+              </w:rPr>
+              <w:t>full</w:t>
+            </w:r>
+            <w:r>
+              <w:rPr>
+                <w:b/>
+                <w:sz w:val="24"/>
+                <w:szCs w:val="24"/>
+                <w:u w:val="single"/>
+              </w:rPr>
+              <w:t>_</w:t>
+            </w:r>
+            <w:r>
+              <w:rPr>
+                <w:b/>
+                <w:sz w:val="24"/>
+                <w:szCs w:val="24"/>
+                <w:u w:val="single"/>
+                <w:lang w:val="en-US"/>
+              </w:rPr>
+              <w:t>name</w:t>
+            </w:r>
+            <w:r>
+              <w:rPr>
+                <w:b/>
+                <w:sz w:val="24"/>
+                <w:szCs w:val="24"/>
+                <w:u w:val="single"/>
+              </w:rPr>
+              <w:t xml:space="preserve"> }}</w:t>
+            </w:r>
+            <w:r>
+              <w:rPr>
+                <w:b/>
+                <w:sz w:val="24"/>
+                <w:szCs w:val="24"/>
+                <w:u w:val="single"/>
+              </w:rPr>
+              <w:t>___________________________</w:t>
+            </w:r>
+            <w:r>
+              <w:rPr>
+                <w:sz w:val="24"/>
+                <w:szCs w:val="24"/>
               </w:rPr>
               <w:t xml:space="preserve"> </w:t>
             </w:r>
-            <w:r>
-              <w:rPr>
-                <w:b/>
-                <w:sz w:val="24"/>
-                <w:szCs w:val="24"/>
-                <w:u w:val="single"/>
-                <w:lang w:val="en-US"/>
+          </w:p>
+          <w:p>
+            <w:pPr>
+              <w:spacing w:line="216" w:lineRule="auto"/>
+              <w:rPr>
+                <w:b/>
+                <w:sz w:val="24"/>
+                <w:szCs w:val="24"/>
+              </w:rPr>
+            </w:pPr>
+            <w:r>
+              <w:rPr>
+                <w:sz w:val="24"/>
+                <w:szCs w:val="24"/>
+              </w:rPr>
+              <w:t xml:space="preserve"> </w:t>
+            </w:r>
+            <w:r>
+              <w:rPr>
+                <w:sz w:val="24"/>
+                <w:szCs w:val="24"/>
+              </w:rPr>
+              <w:t>гр</w:t>
+            </w:r>
+            <w:r>
+              <w:rPr>
+                <w:sz w:val="24"/>
+                <w:szCs w:val="24"/>
+              </w:rPr>
+              <w:t>.</w:t>
+            </w:r>
+            <w:r>
+              <w:rPr>
+                <w:sz w:val="24"/>
+                <w:szCs w:val="24"/>
+              </w:rPr>
+              <w:t xml:space="preserve"> </w:t>
+            </w:r>
+            <w:r>
+              <w:rPr>
+                <w:b/>
+                <w:sz w:val="24"/>
+                <w:szCs w:val="24"/>
+                <w:u w:val="single"/>
+              </w:rPr>
+              <w:t xml:space="preserve">{{ </w:t>
+            </w:r>
+            <w:r>
+              <w:rPr>
+                <w:b/>
+                <w:sz w:val="24"/>
+                <w:szCs w:val="24"/>
+                <w:u w:val="single"/>
+                <w:lang w:val="en-US"/>
+              </w:rPr>
+              <w:t>group</w:t>
+            </w:r>
+            <w:r>
+              <w:rPr>
+                <w:b/>
+                <w:sz w:val="24"/>
+                <w:szCs w:val="24"/>
+                <w:u w:val="single"/>
               </w:rPr>
               <w:t>_</w:t>
             </w:r>
-            <w:proofErr w:type="gramStart"/>
-            <w:r>
-              <w:rPr>
-                <w:b/>
-                <w:sz w:val="24"/>
-                <w:szCs w:val="24"/>
-                <w:u w:val="single"/>
-                <w:lang w:val="en-US"/>
-              </w:rPr>
-              <w:t>_</w:t>
-            </w:r>
-            <w:r>
-              <w:rPr>
-                <w:b/>
-                <w:sz w:val="24"/>
-                <w:szCs w:val="24"/>
-                <w:u w:val="single"/>
-                <w:lang w:val="en-US"/>
-              </w:rPr>
-              <w:t>{</w:t>
-            </w:r>
-            <w:proofErr w:type="gramEnd"/>
-            <w:r>
-              <w:rPr>
-                <w:b/>
-                <w:sz w:val="24"/>
-                <w:szCs w:val="24"/>
-                <w:u w:val="single"/>
-                <w:lang w:val="en-US"/>
-              </w:rPr>
-              <w:t xml:space="preserve">{ </w:t>
-            </w:r>
-            <w:proofErr w:type="spellStart"/>
-            <w:r>
-              <w:rPr>
-                <w:b/>
-                <w:sz w:val="24"/>
-                <w:szCs w:val="24"/>
-                <w:u w:val="single"/>
-                <w:lang w:val="en-US"/>
-              </w:rPr>
-              <w:t>student_full_name</w:t>
-            </w:r>
-            <w:proofErr w:type="spellEnd"/>
-            <w:r>
-              <w:rPr>
-                <w:b/>
-                <w:sz w:val="24"/>
-                <w:szCs w:val="24"/>
-                <w:u w:val="single"/>
-                <w:lang w:val="en-US"/>
+            <w:r>
+              <w:rPr>
+                <w:b/>
+                <w:sz w:val="24"/>
+                <w:szCs w:val="24"/>
+                <w:u w:val="single"/>
+                <w:lang w:val="en-US"/>
+              </w:rPr>
+              <w:t>name</w:t>
+            </w:r>
+            <w:r>
+              <w:rPr>
+                <w:b/>
+                <w:sz w:val="24"/>
+                <w:szCs w:val="24"/>
+                <w:u w:val="single"/>
               </w:rPr>
               <w:t xml:space="preserve"> }}</w:t>
             </w:r>
-            <w:r>
-              <w:rPr>
-                <w:b/>
-                <w:sz w:val="24"/>
-                <w:szCs w:val="24"/>
-                <w:u w:val="single"/>
-                <w:lang w:val="en-US"/>
-              </w:rPr>
-              <w:t>___________________________</w:t>
-            </w:r>
-            <w:r>
-              <w:rPr>
-                <w:sz w:val="24"/>
-                <w:szCs w:val="24"/>
-                <w:lang w:val="en-US"/>
-              </w:rPr>
-              <w:t xml:space="preserve"> </w:t>
-            </w:r>
-          </w:p>
-          <w:p>
-            <w:pPr>
-              <w:spacing w:line="216" w:lineRule="auto"/>
-              <w:rPr>
-                <w:b/>
-                <w:sz w:val="24"/>
-                <w:szCs w:val="24"/>
-                <w:lang w:val="en-US"/>
-              </w:rPr>
-            </w:pPr>
-            <w:r>
-              <w:rPr>
-                <w:sz w:val="24"/>
-                <w:szCs w:val="24"/>
-                <w:lang w:val="en-US"/>
-              </w:rPr>
-              <w:t xml:space="preserve"> </w:t>
-            </w:r>
-            <w:proofErr w:type="spellStart"/>
-            <w:r>
-              <w:rPr>
-                <w:sz w:val="24"/>
-                <w:szCs w:val="24"/>
-              </w:rPr>
-              <w:t>гр</w:t>
-            </w:r>
-            <w:proofErr w:type="spellEnd"/>
-            <w:r>
-              <w:rPr>
-                <w:sz w:val="24"/>
-                <w:szCs w:val="24"/>
-                <w:lang w:val="en-US"/>
-              </w:rPr>
-              <w:t>.</w:t>
-            </w:r>
-            <w:r>
-              <w:rPr>
-                <w:sz w:val="24"/>
-                <w:szCs w:val="24"/>
-                <w:lang w:val="en-US"/>
-              </w:rPr>
-              <w:t xml:space="preserve"> </w:t>
-            </w:r>
-            <w:proofErr w:type="gramStart"/>
-            <w:r>
-              <w:rPr>
-                <w:b/>
-                <w:sz w:val="24"/>
-                <w:szCs w:val="24"/>
-                <w:u w:val="single"/>
-                <w:lang w:val="en-US"/>
-              </w:rPr>
-              <w:t xml:space="preserve">{{ </w:t>
-            </w:r>
-            <w:proofErr w:type="spellStart"/>
-            <w:r>
-              <w:rPr>
-                <w:b/>
-                <w:sz w:val="24"/>
-                <w:szCs w:val="24"/>
-                <w:u w:val="single"/>
-                <w:lang w:val="en-US"/>
-              </w:rPr>
-              <w:t>group</w:t>
-            </w:r>
-            <w:proofErr w:type="gramEnd"/>
-            <w:r>
-              <w:rPr>
-                <w:b/>
-                <w:sz w:val="24"/>
-                <w:szCs w:val="24"/>
-                <w:u w:val="single"/>
-                <w:lang w:val="en-US"/>
-              </w:rPr>
-              <w:t>_name</w:t>
-            </w:r>
-            <w:proofErr w:type="spellEnd"/>
-            <w:r>
-              <w:rPr>
-                <w:b/>
-                <w:sz w:val="24"/>
-                <w:szCs w:val="24"/>
-                <w:u w:val="single"/>
-                <w:lang w:val="en-US"/>
-              </w:rPr>
-              <w:t xml:space="preserve"> }}</w:t>
-            </w:r>
-          </w:p>
-          <w:p>
-            <w:pPr>
-              <w:rPr>
-                <w:sz w:val="16"/>
-                <w:szCs w:val="16"/>
-                <w:lang w:val="en-US"/>
-              </w:rPr>
-            </w:pPr>
-            <w:r>
-              <w:rPr>
-                <w:sz w:val="16"/>
-                <w:szCs w:val="16"/>
-                <w:lang w:val="en-US"/>
+          </w:p>
+          <w:p>
+            <w:pPr>
+              <w:rPr>
+                <w:sz w:val="16"/>
+                <w:szCs w:val="16"/>
+              </w:rPr>
+            </w:pPr>
+            <w:r>
+              <w:rPr>
+                <w:sz w:val="16"/>
+                <w:szCs w:val="16"/>
               </w:rPr>
               <w:t xml:space="preserve">           </w:t>
             </w:r>
@@ -2770,7 +2648,6 @@
               <w:rPr>
                 <w:sz w:val="16"/>
                 <w:szCs w:val="16"/>
-                <w:lang w:val="en-US"/>
               </w:rPr>
               <w:t xml:space="preserve"> </w:t>
             </w:r>
@@ -3181,23 +3058,7 @@
                 <w:sz w:val="24"/>
                 <w:szCs w:val="24"/>
               </w:rPr>
-              <w:t>____________</w:t>
-            </w:r>
-            <w:proofErr w:type="gramStart"/>
-            <w:r>
-              <w:rPr>
-                <w:sz w:val="24"/>
-                <w:szCs w:val="24"/>
-              </w:rPr>
-              <w:t>_  _</w:t>
-            </w:r>
-            <w:proofErr w:type="gramEnd"/>
-            <w:r>
-              <w:rPr>
-                <w:sz w:val="24"/>
-                <w:szCs w:val="24"/>
-              </w:rPr>
-              <w:t>______________________    Дата выдачи _________</w:t>
+              <w:t>_____________  _______________________    Дата выдачи _________</w:t>
             </w:r>
           </w:p>
           <w:p>
@@ -3212,23 +3073,7 @@
                 <w:sz w:val="16"/>
                 <w:szCs w:val="16"/>
               </w:rPr>
-              <w:t xml:space="preserve"> (</w:t>
-            </w:r>
-            <w:proofErr w:type="gramStart"/>
-            <w:r>
-              <w:rPr>
-                <w:sz w:val="16"/>
-                <w:szCs w:val="16"/>
-              </w:rPr>
-              <w:t xml:space="preserve">подпись)   </w:t>
-            </w:r>
-            <w:proofErr w:type="gramEnd"/>
-            <w:r>
-              <w:rPr>
-                <w:sz w:val="16"/>
-                <w:szCs w:val="16"/>
-              </w:rPr>
-              <w:t xml:space="preserve">                                 (инициалы, фамилия)</w:t>
+              <w:t xml:space="preserve"> (подпись)                                    (инициалы, фамилия)</w:t>
             </w:r>
           </w:p>
           <w:p>
@@ -3266,23 +3111,7 @@
                 <w:sz w:val="24"/>
                 <w:szCs w:val="24"/>
               </w:rPr>
-              <w:t>Студент   _________</w:t>
-            </w:r>
-            <w:proofErr w:type="gramStart"/>
-            <w:r>
-              <w:rPr>
-                <w:sz w:val="24"/>
-                <w:szCs w:val="24"/>
-              </w:rPr>
-              <w:t>_  _</w:t>
-            </w:r>
-            <w:proofErr w:type="gramEnd"/>
-            <w:r>
-              <w:rPr>
-                <w:sz w:val="24"/>
-                <w:szCs w:val="24"/>
-              </w:rPr>
-              <w:t>________________    Дата получения _________</w:t>
+              <w:t>Студент   __________  _________________    Дата получения _________</w:t>
             </w:r>
           </w:p>
           <w:p>
@@ -3298,23 +3127,7 @@
                 <w:szCs w:val="16"/>
               </w:rPr>
               <w:tab/>
-              <w:t xml:space="preserve">                   (</w:t>
-            </w:r>
-            <w:proofErr w:type="gramStart"/>
-            <w:r>
-              <w:rPr>
-                <w:sz w:val="16"/>
-                <w:szCs w:val="16"/>
-              </w:rPr>
-              <w:t xml:space="preserve">подпись)   </w:t>
-            </w:r>
-            <w:proofErr w:type="gramEnd"/>
-            <w:r>
-              <w:rPr>
-                <w:sz w:val="16"/>
-                <w:szCs w:val="16"/>
-              </w:rPr>
-              <w:t xml:space="preserve">         (инициалы, фамилия)</w:t>
+              <w:t xml:space="preserve">                   (подпись)            (инициалы, фамилия)</w:t>
             </w:r>
           </w:p>
         </w:tc>
@@ -3404,8 +3217,124 @@
                 <w:u w:val="single"/>
                 <w:lang w:val="en-US"/>
               </w:rPr>
+              <w:t xml:space="preserve">{{ </w:t>
+            </w:r>
+            <w:proofErr w:type="spellStart"/>
+            <w:r>
+              <w:rPr>
+                <w:b/>
+                <w:sz w:val="24"/>
+                <w:szCs w:val="24"/>
+                <w:u w:val="single"/>
+                <w:lang w:val="en-US"/>
+              </w:rPr>
+              <w:t>student</w:t>
+            </w:r>
+            <w:r>
+              <w:rPr>
+                <w:b/>
+                <w:sz w:val="24"/>
+                <w:szCs w:val="24"/>
+                <w:u w:val="single"/>
+                <w:lang w:val="en-US"/>
+              </w:rPr>
               <w:t>_</w:t>
             </w:r>
+            <w:r>
+              <w:rPr>
+                <w:b/>
+                <w:sz w:val="24"/>
+                <w:szCs w:val="24"/>
+                <w:u w:val="single"/>
+                <w:lang w:val="en-US"/>
+              </w:rPr>
+              <w:t>full</w:t>
+            </w:r>
+            <w:r>
+              <w:rPr>
+                <w:b/>
+                <w:sz w:val="24"/>
+                <w:szCs w:val="24"/>
+                <w:u w:val="single"/>
+                <w:lang w:val="en-US"/>
+              </w:rPr>
+              <w:t>_</w:t>
+            </w:r>
+            <w:r>
+              <w:rPr>
+                <w:b/>
+                <w:sz w:val="24"/>
+                <w:szCs w:val="24"/>
+                <w:u w:val="single"/>
+                <w:lang w:val="en-US"/>
+              </w:rPr>
+              <w:t>name</w:t>
+            </w:r>
+            <w:proofErr w:type="spellEnd"/>
+            <w:r>
+              <w:rPr>
+                <w:b/>
+                <w:sz w:val="24"/>
+                <w:szCs w:val="24"/>
+                <w:u w:val="single"/>
+                <w:lang w:val="en-US"/>
+              </w:rPr>
+              <w:t xml:space="preserve"> }}</w:t>
+            </w:r>
+            <w:r>
+              <w:rPr>
+                <w:sz w:val="24"/>
+                <w:szCs w:val="24"/>
+                <w:lang w:val="en-US"/>
+              </w:rPr>
+              <w:t xml:space="preserve"> </w:t>
+            </w:r>
+          </w:p>
+          <w:p>
+            <w:pPr>
+              <w:spacing w:line="216" w:lineRule="auto"/>
+              <w:rPr>
+                <w:sz w:val="16"/>
+                <w:szCs w:val="16"/>
+                <w:lang w:val="en-US"/>
+              </w:rPr>
+            </w:pPr>
+            <w:r>
+              <w:rPr>
+                <w:sz w:val="16"/>
+                <w:szCs w:val="16"/>
+                <w:lang w:val="en-US"/>
+              </w:rPr>
+              <w:t xml:space="preserve">                                                                        </w:t>
+            </w:r>
+          </w:p>
+          <w:p>
+            <w:pPr>
+              <w:spacing w:line="216" w:lineRule="auto"/>
+              <w:ind w:firstLine="27"/>
+              <w:rPr>
+                <w:sz w:val="16"/>
+                <w:szCs w:val="16"/>
+                <w:lang w:val="en-US"/>
+              </w:rPr>
+            </w:pPr>
+            <w:proofErr w:type="spellStart"/>
+            <w:r>
+              <w:rPr>
+                <w:sz w:val="24"/>
+                <w:szCs w:val="24"/>
+              </w:rPr>
+              <w:t>гр</w:t>
+            </w:r>
+            <w:proofErr w:type="spellEnd"/>
+            <w:r>
+              <w:rPr>
+                <w:sz w:val="24"/>
+                <w:szCs w:val="24"/>
+                <w:lang w:val="en-US"/>
+              </w:rPr>
+              <w:t xml:space="preserve">. </w:t>
+            </w:r>
             <w:proofErr w:type="gramStart"/>
             <w:r>
               <w:rPr>
@@ -3415,7 +3344,18 @@
                 <w:u w:val="single"/>
                 <w:lang w:val="en-US"/>
               </w:rPr>
-              <w:t>_{</w:t>
+              <w:t xml:space="preserve">{{ </w:t>
+            </w:r>
+            <w:proofErr w:type="spellStart"/>
+            <w:r>
+              <w:rPr>
+                <w:b/>
+                <w:sz w:val="24"/>
+                <w:szCs w:val="24"/>
+                <w:u w:val="single"/>
+                <w:lang w:val="en-US"/>
+              </w:rPr>
+              <w:t>group</w:t>
             </w:r>
             <w:proofErr w:type="gramEnd"/>
             <w:r>
@@ -3426,22 +3366,127 @@
                 <w:u w:val="single"/>
                 <w:lang w:val="en-US"/>
               </w:rPr>
+              <w:t>_</w:t>
+            </w:r>
+            <w:r>
+              <w:rPr>
+                <w:b/>
+                <w:sz w:val="24"/>
+                <w:szCs w:val="24"/>
+                <w:u w:val="single"/>
+                <w:lang w:val="en-US"/>
+              </w:rPr>
+              <w:t>name</w:t>
+            </w:r>
+            <w:proofErr w:type="spellEnd"/>
+            <w:r>
+              <w:rPr>
+                <w:b/>
+                <w:sz w:val="24"/>
+                <w:szCs w:val="24"/>
+                <w:u w:val="single"/>
+                <w:lang w:val="en-US"/>
+              </w:rPr>
+              <w:t xml:space="preserve"> }}</w:t>
+            </w:r>
+            <w:r>
+              <w:rPr>
+                <w:sz w:val="16"/>
+                <w:szCs w:val="16"/>
+                <w:lang w:val="en-US"/>
+              </w:rPr>
+              <w:t xml:space="preserve">        </w:t>
+            </w:r>
+          </w:p>
+          <w:p>
+            <w:pPr>
+              <w:spacing w:line="216" w:lineRule="auto"/>
+              <w:rPr>
+                <w:sz w:val="16"/>
+                <w:szCs w:val="16"/>
+                <w:lang w:val="en-US"/>
+              </w:rPr>
+            </w:pPr>
+          </w:p>
+          <w:p>
+            <w:pPr>
+              <w:spacing w:line="216" w:lineRule="auto"/>
+              <w:rPr>
+                <w:sz w:val="24"/>
+                <w:szCs w:val="24"/>
+                <w:lang w:val="en-US"/>
+              </w:rPr>
+            </w:pPr>
+            <w:r>
+              <w:rPr>
+                <w:sz w:val="24"/>
+                <w:szCs w:val="24"/>
+              </w:rPr>
+              <w:t>Вид</w:t>
+            </w:r>
+            <w:r>
+              <w:rPr>
+                <w:sz w:val="24"/>
+                <w:szCs w:val="24"/>
+                <w:lang w:val="en-US"/>
+              </w:rPr>
+              <w:t xml:space="preserve"> </w:t>
+            </w:r>
+            <w:r>
+              <w:rPr>
+                <w:sz w:val="24"/>
+                <w:szCs w:val="24"/>
+              </w:rPr>
+              <w:t>практики</w:t>
+            </w:r>
+            <w:r>
+              <w:rPr>
+                <w:sz w:val="24"/>
+                <w:szCs w:val="24"/>
+                <w:lang w:val="en-US"/>
+              </w:rPr>
+              <w:t>_</w:t>
+            </w:r>
+            <w:proofErr w:type="gramStart"/>
+            <w:r>
+              <w:rPr>
+                <w:sz w:val="24"/>
+                <w:szCs w:val="24"/>
+                <w:lang w:val="en-US"/>
+              </w:rPr>
+              <w:t>_</w:t>
+            </w:r>
+            <w:r>
+              <w:rPr>
+                <w:sz w:val="24"/>
+                <w:szCs w:val="24"/>
+                <w:u w:val="single"/>
+                <w:lang w:val="en-US"/>
+              </w:rPr>
+              <w:t>{</w:t>
+            </w:r>
+            <w:proofErr w:type="gramEnd"/>
+            <w:r>
+              <w:rPr>
+                <w:sz w:val="24"/>
+                <w:szCs w:val="24"/>
+                <w:u w:val="single"/>
+                <w:lang w:val="en-US"/>
+              </w:rPr>
               <w:t xml:space="preserve">{ </w:t>
             </w:r>
             <w:proofErr w:type="spellStart"/>
             <w:r>
               <w:rPr>
-                <w:b/>
-                <w:sz w:val="24"/>
-                <w:szCs w:val="24"/>
-                <w:u w:val="single"/>
-                <w:lang w:val="en-US"/>
-              </w:rPr>
-              <w:t>student</w:t>
-            </w:r>
-            <w:r>
-              <w:rPr>
-                <w:b/>
+                <w:sz w:val="24"/>
+                <w:szCs w:val="24"/>
+                <w:u w:val="single"/>
+                <w:lang w:val="en-US"/>
+              </w:rPr>
+              <w:t>practice</w:t>
+            </w:r>
+            <w:r>
+              <w:rPr>
                 <w:sz w:val="24"/>
                 <w:szCs w:val="24"/>
                 <w:u w:val="single"/>
@@ -3451,146 +3496,16 @@
             </w:r>
             <w:r>
               <w:rPr>
-                <w:b/>
-                <w:sz w:val="24"/>
-                <w:szCs w:val="24"/>
-                <w:u w:val="single"/>
-                <w:lang w:val="en-US"/>
-              </w:rPr>
-              <w:t>full</w:t>
-            </w:r>
-            <w:r>
-              <w:rPr>
-                <w:b/>
-                <w:sz w:val="24"/>
-                <w:szCs w:val="24"/>
-                <w:u w:val="single"/>
-                <w:lang w:val="en-US"/>
-              </w:rPr>
-              <w:t>_</w:t>
-            </w:r>
-            <w:r>
-              <w:rPr>
-                <w:b/>
-                <w:sz w:val="24"/>
-                <w:szCs w:val="24"/>
-                <w:u w:val="single"/>
-                <w:lang w:val="en-US"/>
-              </w:rPr>
-              <w:t>name</w:t>
+                <w:sz w:val="24"/>
+                <w:szCs w:val="24"/>
+                <w:u w:val="single"/>
+                <w:lang w:val="en-US"/>
+              </w:rPr>
+              <w:t>type</w:t>
             </w:r>
             <w:proofErr w:type="spellEnd"/>
             <w:r>
               <w:rPr>
-                <w:b/>
-                <w:sz w:val="24"/>
-                <w:szCs w:val="24"/>
-                <w:u w:val="single"/>
-                <w:lang w:val="en-US"/>
-              </w:rPr>
-              <w:t xml:space="preserve"> }}___________________________</w:t>
-            </w:r>
-            <w:r>
-              <w:rPr>
-                <w:sz w:val="24"/>
-                <w:szCs w:val="24"/>
-                <w:lang w:val="en-US"/>
-              </w:rPr>
-              <w:t xml:space="preserve"> </w:t>
-            </w:r>
-          </w:p>
-          <w:p>
-            <w:pPr>
-              <w:spacing w:line="216" w:lineRule="auto"/>
-              <w:rPr>
-                <w:sz w:val="16"/>
-                <w:szCs w:val="16"/>
-                <w:lang w:val="en-US"/>
-              </w:rPr>
-            </w:pPr>
-            <w:r>
-              <w:rPr>
-                <w:sz w:val="16"/>
-                <w:szCs w:val="16"/>
-                <w:lang w:val="en-US"/>
-              </w:rPr>
-              <w:t xml:space="preserve">                                                                        </w:t>
-            </w:r>
-          </w:p>
-          <w:p>
-            <w:pPr>
-              <w:spacing w:line="216" w:lineRule="auto"/>
-              <w:ind w:firstLine="27"/>
-              <w:rPr>
-                <w:sz w:val="16"/>
-                <w:szCs w:val="16"/>
-                <w:lang w:val="en-US"/>
-              </w:rPr>
-            </w:pPr>
-            <w:proofErr w:type="spellStart"/>
-            <w:r>
-              <w:rPr>
-                <w:sz w:val="24"/>
-                <w:szCs w:val="24"/>
-              </w:rPr>
-              <w:t>гр</w:t>
-            </w:r>
-            <w:proofErr w:type="spellEnd"/>
-            <w:r>
-              <w:rPr>
-                <w:sz w:val="24"/>
-                <w:szCs w:val="24"/>
-                <w:lang w:val="en-US"/>
-              </w:rPr>
-              <w:t xml:space="preserve">. </w:t>
-            </w:r>
-            <w:proofErr w:type="gramStart"/>
-            <w:r>
-              <w:rPr>
-                <w:b/>
-                <w:sz w:val="24"/>
-                <w:szCs w:val="24"/>
-                <w:u w:val="single"/>
-                <w:lang w:val="en-US"/>
-              </w:rPr>
-              <w:t xml:space="preserve">{{ </w:t>
-            </w:r>
-            <w:proofErr w:type="spellStart"/>
-            <w:r>
-              <w:rPr>
-                <w:b/>
-                <w:sz w:val="24"/>
-                <w:szCs w:val="24"/>
-                <w:u w:val="single"/>
-                <w:lang w:val="en-US"/>
-              </w:rPr>
-              <w:t>group</w:t>
-            </w:r>
-            <w:proofErr w:type="gramEnd"/>
-            <w:r>
-              <w:rPr>
-                <w:b/>
-                <w:sz w:val="24"/>
-                <w:szCs w:val="24"/>
-                <w:u w:val="single"/>
-                <w:lang w:val="en-US"/>
-              </w:rPr>
-              <w:t>_</w:t>
-            </w:r>
-            <w:r>
-              <w:rPr>
-                <w:b/>
-                <w:sz w:val="24"/>
-                <w:szCs w:val="24"/>
-                <w:u w:val="single"/>
-                <w:lang w:val="en-US"/>
-              </w:rPr>
-              <w:t>name</w:t>
-            </w:r>
-            <w:proofErr w:type="spellEnd"/>
-            <w:r>
-              <w:rPr>
-                <w:b/>
                 <w:sz w:val="24"/>
                 <w:szCs w:val="24"/>
                 <w:u w:val="single"/>
@@ -3600,101 +3515,9 @@
             </w:r>
             <w:r>
               <w:rPr>
-                <w:sz w:val="16"/>
-                <w:szCs w:val="16"/>
-                <w:lang w:val="en-US"/>
-              </w:rPr>
-              <w:t xml:space="preserve">        </w:t>
-            </w:r>
-          </w:p>
-          <w:p>
-            <w:pPr>
-              <w:spacing w:line="216" w:lineRule="auto"/>
-              <w:rPr>
-                <w:sz w:val="16"/>
-                <w:szCs w:val="16"/>
-                <w:lang w:val="en-US"/>
-              </w:rPr>
-            </w:pPr>
-          </w:p>
-          <w:p>
-            <w:pPr>
-              <w:spacing w:line="216" w:lineRule="auto"/>
-              <w:rPr>
-                <w:sz w:val="24"/>
-                <w:szCs w:val="24"/>
-              </w:rPr>
-            </w:pPr>
-            <w:r>
-              <w:rPr>
-                <w:sz w:val="24"/>
-                <w:szCs w:val="24"/>
-              </w:rPr>
-              <w:t>Вид практики_</w:t>
-            </w:r>
-            <w:proofErr w:type="gramStart"/>
-            <w:r>
-              <w:rPr>
-                <w:sz w:val="24"/>
-                <w:szCs w:val="24"/>
-              </w:rPr>
-              <w:t>_</w:t>
-            </w:r>
-            <w:r>
-              <w:rPr>
-                <w:sz w:val="24"/>
-                <w:szCs w:val="24"/>
-                <w:u w:val="single"/>
-              </w:rPr>
-              <w:t>{</w:t>
-            </w:r>
-            <w:proofErr w:type="gramEnd"/>
-            <w:r>
-              <w:rPr>
-                <w:sz w:val="24"/>
-                <w:szCs w:val="24"/>
-                <w:u w:val="single"/>
-              </w:rPr>
-              <w:t xml:space="preserve">{ </w:t>
-            </w:r>
-            <w:r>
-              <w:rPr>
-                <w:sz w:val="24"/>
-                <w:szCs w:val="24"/>
-                <w:u w:val="single"/>
-                <w:lang w:val="en-US"/>
-              </w:rPr>
-              <w:t>practice</w:t>
-            </w:r>
-            <w:r>
-              <w:rPr>
-                <w:sz w:val="24"/>
-                <w:szCs w:val="24"/>
-                <w:u w:val="single"/>
-              </w:rPr>
-              <w:t>_</w:t>
-            </w:r>
-            <w:r>
-              <w:rPr>
-                <w:sz w:val="24"/>
-                <w:szCs w:val="24"/>
-                <w:u w:val="single"/>
-                <w:lang w:val="en-US"/>
-              </w:rPr>
-              <w:t>type</w:t>
-            </w:r>
-            <w:r>
-              <w:rPr>
-                <w:sz w:val="24"/>
-                <w:szCs w:val="24"/>
-                <w:u w:val="single"/>
-              </w:rPr>
-              <w:t xml:space="preserve"> }}</w:t>
-            </w:r>
-            <w:r>
-              <w:rPr>
-                <w:sz w:val="24"/>
-                <w:szCs w:val="24"/>
+                <w:sz w:val="24"/>
+                <w:szCs w:val="24"/>
+                <w:lang w:val="en-US"/>
               </w:rPr>
               <w:t>______________________</w:t>
             </w:r>

</xml_diff>